<commit_message>
Docs Individuales GA, 1.5 Grupal y Evidencia Adicional Plantilla HDU
</commit_message>
<xml_diff>
--- a/Fase 1/Evidencias Grupales/1.5_GuiaEstudiante_Fase 1_Definicion Proyecto APT.docx
+++ b/Fase 1/Evidencias Grupales/1.5_GuiaEstudiante_Fase 1_Definicion Proyecto APT.docx
@@ -340,7 +340,7 @@
         <w:widowControl w:val="1"/>
         <w:numPr>
           <w:ilvl w:val="0"/>
-          <w:numId w:val="1"/>
+          <w:numId w:val="10"/>
         </w:numPr>
         <w:pBdr>
           <w:top w:space="0" w:sz="0" w:val="nil"/>
@@ -601,8 +601,11 @@
             </w:pPr>
             <w:r>
               <w:rPr>
-                <w:rtl w:val="0"/>
-              </w:rPr>
+                <w:b w:val="1"/>
+                <w:bCs w:val="1"/>
+                <w:rtl w:val="0"/>
+              </w:rPr>
+              <w:t xml:space="preserve">Gabriela Antúnez, </w:t>
             </w:r>
           </w:p>
         </w:tc>
@@ -647,8 +650,11 @@
             </w:pPr>
             <w:r>
               <w:rPr>
-                <w:rtl w:val="0"/>
-              </w:rPr>
+                <w:b w:val="1"/>
+                <w:bCs w:val="1"/>
+                <w:rtl w:val="0"/>
+              </w:rPr>
+              <w:t xml:space="preserve">20.721.403-5, </w:t>
             </w:r>
           </w:p>
         </w:tc>
@@ -693,8 +699,11 @@
             </w:pPr>
             <w:r>
               <w:rPr>
-                <w:rtl w:val="0"/>
-              </w:rPr>
+                <w:b w:val="1"/>
+                <w:bCs w:val="1"/>
+                <w:rtl w:val="0"/>
+              </w:rPr>
+              <w:t xml:space="preserve">Ingeniería en Informática</w:t>
             </w:r>
           </w:p>
         </w:tc>
@@ -739,8 +748,11 @@
             </w:pPr>
             <w:r>
               <w:rPr>
-                <w:rtl w:val="0"/>
-              </w:rPr>
+                <w:b w:val="1"/>
+                <w:bCs w:val="1"/>
+                <w:rtl w:val="0"/>
+              </w:rPr>
+              <w:t xml:space="preserve">Plaza Oeste</w:t>
             </w:r>
           </w:p>
         </w:tc>
@@ -974,15 +986,9 @@
             </w:pPr>
             <w:r>
               <w:rPr>
-                <w:rFonts w:ascii="Calibri" w:cs="Calibri" w:eastAsia="Calibri" w:hAnsi="Calibri"/>
-                <w:i w:val="1"/>
-                <w:iCs w:val="1"/>
-                <w:color w:val="548dd4"/>
-                <w:sz w:val="20"/>
-                <w:szCs w:val="20"/>
-                <w:rtl w:val="0"/>
-              </w:rPr>
-              <w:t xml:space="preserve">Escribe el nombre de tu Proyecto APT.</w:t>
+                <w:rtl w:val="0"/>
+              </w:rPr>
+              <w:t xml:space="preserve">LifeBetter AIoT: Plataforma Inteligente de Gestión Inmobiliaria y Control de Accesos</w:t>
             </w:r>
             <w:r>
               <w:rPr>
@@ -1025,22 +1031,25 @@
           </w:tcPr>
           <w:p>
             <w:pPr>
-              <w:rPr>
-                <w:b w:val="1"/>
-                <w:bCs w:val="1"/>
-              </w:rPr>
-            </w:pPr>
-            <w:r>
-              <w:rPr>
-                <w:rFonts w:ascii="Calibri" w:cs="Calibri" w:eastAsia="Calibri" w:hAnsi="Calibri"/>
-                <w:i w:val="1"/>
-                <w:iCs w:val="1"/>
-                <w:color w:val="548dd4"/>
-                <w:sz w:val="20"/>
-                <w:szCs w:val="20"/>
-                <w:rtl w:val="0"/>
-              </w:rPr>
-              <w:t xml:space="preserve">Menciona la(s) área(s) de desempeño de tu Plan de Estudio que vas a abordar en tu Proyecto APT.</w:t>
+              <w:rPr/>
+            </w:pPr>
+            <w:r>
+              <w:rPr>
+                <w:rtl w:val="0"/>
+              </w:rPr>
+              <w:t xml:space="preserve">Desarrollo de Software, Análisis y Evaluación de soluciones informáticas, Calidad de Software, Gestión de Proyectos Informáticos, Automatización, IoT, </w:t>
+            </w:r>
+            <w:r>
+              <w:rPr>
+                <w:rtl w:val="0"/>
+              </w:rPr>
+              <w:t xml:space="preserve">AIoT</w:t>
+            </w:r>
+            <w:r>
+              <w:rPr>
+                <w:rtl w:val="0"/>
+              </w:rPr>
+              <w:t xml:space="preserve">, Generative AI, Data Science y Seguridad.</w:t>
             </w:r>
             <w:r>
               <w:rPr>
@@ -1096,22 +1105,35 @@
           </w:tcPr>
           <w:p>
             <w:pPr>
-              <w:rPr>
-                <w:b w:val="1"/>
-                <w:bCs w:val="1"/>
-              </w:rPr>
-            </w:pPr>
-            <w:r>
-              <w:rPr>
-                <w:rFonts w:ascii="Calibri" w:cs="Calibri" w:eastAsia="Calibri" w:hAnsi="Calibri"/>
-                <w:i w:val="1"/>
-                <w:iCs w:val="1"/>
-                <w:color w:val="548dd4"/>
-                <w:sz w:val="20"/>
-                <w:szCs w:val="20"/>
-                <w:rtl w:val="0"/>
-              </w:rPr>
-              <w:t xml:space="preserve">Menciona las competencias de tu Plan de Estudio que vas a abordar en tu Proyecto APT.</w:t>
+              <w:rPr/>
+            </w:pPr>
+            <w:r>
+              <w:rPr>
+                <w:rtl w:val="0"/>
+              </w:rPr>
+              <w:t xml:space="preserve">Desarrollar una solución de software utilizando técnicas que permitan sistematizar el proceso de desarrollo y mantenimiento, asegurando el logro de los objetivos.</w:t>
+              <w:br w:type="textWrapping"/>
+              <w:br w:type="textWrapping"/>
+              <w:t xml:space="preserve">Construir modelos de datos para soportar los requerimientos de la organización de acuerdo a un diseño definido y escalable en el tiempo.</w:t>
+              <w:br w:type="textWrapping"/>
+              <w:t xml:space="preserve">Realizar pruebas de certificación tanto de los productos como de los procesos utilizando buenas prácticas definidas por la industria. </w:t>
+              <w:br w:type="textWrapping"/>
+              <w:br w:type="textWrapping"/>
+              <w:t xml:space="preserve">Resolver las vulnerabilidades sistémicas para asegurar que el software construido cumple las normas de seguridad exigidas por la industria. </w:t>
+              <w:br w:type="textWrapping"/>
+              <w:br w:type="textWrapping"/>
+              <w:t xml:space="preserve">Gestionar proyectos informáticos, ofreciendo alternativas para la toma de decisiones de acuerdo a los requerimientos de la organización</w:t>
+            </w:r>
+          </w:p>
+          <w:p>
+            <w:pPr>
+              <w:rPr/>
+            </w:pPr>
+            <w:r>
+              <w:rPr>
+                <w:rtl w:val="0"/>
+              </w:rPr>
+              <w:t xml:space="preserve">Implementar soluciones sistémicas integrales para automatizar y optimizar procesos de negocio de acuerdo a las necesidades de la organización.</w:t>
             </w:r>
             <w:r>
               <w:rPr>
@@ -1282,7 +1304,33 @@
                 <w:vertAlign w:val="baseline"/>
                 <w:rtl w:val="0"/>
               </w:rPr>
-              <w:t xml:space="preserve">A continuación, se presentan distintos campos que debes completar con la información solicitada. Esta sección busca que describas en detalle tu proyecto y justifiques su relevancia y pertinencia.  </w:t>
+              <w:t xml:space="preserve">A continuación, se presentan distintos campos que debes completar con la información solicitada. Esta sección busca que describas en detalle tu proyecto y </w:t>
+            </w:r>
+            <w:r>
+              <w:rPr>
+                <w:color w:val="1f3864"/>
+                <w:rtl w:val="0"/>
+              </w:rPr>
+              <w:t xml:space="preserve">justifiquen</w:t>
+            </w:r>
+            <w:r>
+              <w:rPr>
+                <w:rFonts w:ascii="Calibri" w:cs="Calibri" w:eastAsia="Calibri" w:hAnsi="Calibri"/>
+                <w:b w:val="0"/>
+                <w:bCs w:val="0"/>
+                <w:i w:val="0"/>
+                <w:iCs w:val="0"/>
+                <w:smallCaps w:val="0"/>
+                <w:strike w:val="0"/>
+                <w:color w:val="1f3864"/>
+                <w:sz w:val="22"/>
+                <w:szCs w:val="22"/>
+                <w:u w:val="none"/>
+                <w:shd w:fill="auto" w:val="clear"/>
+                <w:vertAlign w:val="baseline"/>
+                <w:rtl w:val="0"/>
+              </w:rPr>
+              <w:t xml:space="preserve"> su relevancia y pertinencia.  </w:t>
             </w:r>
           </w:p>
         </w:tc>
@@ -1308,7 +1356,7 @@
     <w:tbl>
       <w:tblPr>
         <w:tblStyle w:val="Table6"/>
-        <w:tblW w:w="9498.0" w:type="dxa"/>
+        <w:tblW w:w="9495.0" w:type="dxa"/>
         <w:jc w:val="left"/>
         <w:tblInd w:w="-714.0" w:type="dxa"/>
         <w:tblBorders>
@@ -1323,12 +1371,12 @@
         <w:tblLook w:val="0400"/>
       </w:tblPr>
       <w:tblGrid>
-        <w:gridCol w:w="2386"/>
-        <w:gridCol w:w="7112"/>
+        <w:gridCol w:w="1935"/>
+        <w:gridCol w:w="7560"/>
         <w:tblGridChange w:id="0">
           <w:tblGrid>
-            <w:gridCol w:w="2386"/>
-            <w:gridCol w:w="7112"/>
+            <w:gridCol w:w="1935"/>
+            <w:gridCol w:w="7560"/>
           </w:tblGrid>
         </w:tblGridChange>
       </w:tblGrid>
@@ -1365,256 +1413,327 @@
           </w:tcPr>
           <w:p>
             <w:pPr>
-              <w:jc w:val="both"/>
-              <w:rPr>
-                <w:rFonts w:ascii="Calibri" w:cs="Calibri" w:eastAsia="Calibri" w:hAnsi="Calibri"/>
-                <w:i w:val="1"/>
-                <w:iCs w:val="1"/>
-                <w:color w:val="548dd4"/>
-                <w:sz w:val="20"/>
-                <w:szCs w:val="20"/>
-              </w:rPr>
-            </w:pPr>
-            <w:r>
-              <w:rPr>
-                <w:rFonts w:ascii="Calibri" w:cs="Calibri" w:eastAsia="Calibri" w:hAnsi="Calibri"/>
-                <w:i w:val="1"/>
-                <w:iCs w:val="1"/>
-                <w:color w:val="548dd4"/>
-                <w:sz w:val="20"/>
-                <w:szCs w:val="20"/>
-                <w:rtl w:val="0"/>
-              </w:rPr>
-              <w:t xml:space="preserve">Todo proyecto, ya sea una innovación, producto, servicio, etc., pretende dar respuesta a una situación o problemática. Señala qué problema busca solucionar tu proyecto y la relevancia que tiene para el campo laboral de tu carrera. También menciona el contexto en que esta problemática se sitúa (lugar, a quienes impactaría, etc.). Es importante que esta problemática sea relevante en el contexto de la profesión, siendo su resolución un aporte real o simulado a la organización u entorno en el que se sitúa. Algunas preguntas que pueden ayudarte a responder este apartado son: </w:t>
-            </w:r>
-          </w:p>
-          <w:p>
-            <w:pPr>
-              <w:keepNext w:val="0"/>
-              <w:keepLines w:val="0"/>
-              <w:pageBreakBefore w:val="0"/>
-              <w:widowControl w:val="1"/>
+              <w:spacing w:line="276" w:lineRule="auto"/>
+              <w:rPr/>
+            </w:pPr>
+            <w:r>
+              <w:rPr>
+                <w:rtl w:val="0"/>
+              </w:rPr>
+              <w:t xml:space="preserve">El objetivo principal es centralizar y automatizar todas las operaciones de administración, comunicación y seguridad en comunidades residenciales.</w:t>
+            </w:r>
+            <w:r>
+              <w:rPr>
+                <w:b w:val="1"/>
+                <w:bCs w:val="1"/>
+                <w:rtl w:val="0"/>
+              </w:rPr>
+              <w:br w:type="textWrapping"/>
+              <w:br w:type="textWrapping"/>
+              <w:t xml:space="preserve">Planteamiento del Problema</w:t>
+            </w:r>
+            <w:r>
+              <w:rPr>
+                <w:rtl w:val="0"/>
+              </w:rPr>
+              <w:t xml:space="preserve"> </w:t>
+              <w:br w:type="textWrapping"/>
+              <w:t xml:space="preserve">La gestión habitacional en comunidades y edificios suele depender de procesos fragmentados, manuales y poco eficientes, como planillas Excel desactualizadas y coordinaciones caóticas vía WhatsApp. Esta desarticulación deriva en errores en el cálculo de gastos comunes, falta de transparencia financiera, deficiencias en la trazabilidad operativa y conflictos de convivencia. Además, el control manual de accesos genera cuellos de botella en la portería, pérdida de tiempo y vulnerabilidades de seguridad.</w:t>
+            </w:r>
+            <w:r>
+              <w:rPr>
+                <w:rtl w:val="0"/>
+              </w:rPr>
+              <w:br w:type="textWrapping"/>
+              <w:br w:type="textWrapping"/>
+              <w:t xml:space="preserve"> </w:t>
+            </w:r>
+            <w:r>
+              <w:rPr>
+                <w:rtl w:val="0"/>
+              </w:rPr>
+              <w:t xml:space="preserve">LifeBetter</w:t>
+            </w:r>
+            <w:r>
+              <w:rPr>
+                <w:rtl w:val="0"/>
+              </w:rPr>
+              <w:t xml:space="preserve"> resuelve esta problemática automatizando el cálculo de alícuotas, la conciliación de pagos con Transbank Webpay Plus, la gestión de amenidades y el control de accesos mediante un ecosistema digital avanzado que combina una plataforma SaaS web con AIoT y una aplicación móvil nativa con códigos QR dinámicos.</w:t>
+            </w:r>
+          </w:p>
+          <w:p>
+            <w:pPr>
+              <w:spacing w:after="240" w:line="276" w:lineRule="auto"/>
+              <w:rPr/>
+            </w:pPr>
+            <w:r>
+              <w:rPr>
+                <w:b w:val="1"/>
+                <w:bCs w:val="1"/>
+                <w:rtl w:val="0"/>
+              </w:rPr>
+              <w:t xml:space="preserve">Relevancia para el campo laboral de la carrera</w:t>
+            </w:r>
+            <w:r>
+              <w:rPr>
+                <w:rtl w:val="0"/>
+              </w:rPr>
+              <w:br w:type="textWrapping"/>
+              <w:t xml:space="preserve">Para un Ingeniero en Informática, el desarrollo de esta plataforma aborda competencias clave del perfil de egreso como el diseño de modelos de datos escalables (PostgreSQL), desarrollo de arquitecturas de software modulares y seguras (Python/Django), aseguramiento de calidad (QA/Pytest) y gestión de transacciones críticas bajo lineamientos OWASP. Permite responder a la creciente demanda del sector ProTech por soluciones SaaS robustas, desacopladas y con integración de servicios en tiempo real e inteligencia artificial.</w:t>
+            </w:r>
+          </w:p>
+          <w:p>
+            <w:pPr>
+              <w:spacing w:after="240" w:line="276" w:lineRule="auto"/>
+              <w:rPr>
+                <w:b w:val="1"/>
+                <w:bCs w:val="1"/>
+              </w:rPr>
+            </w:pPr>
+            <w:r>
+              <w:rPr>
+                <w:b w:val="1"/>
+                <w:bCs w:val="1"/>
+                <w:rtl w:val="0"/>
+              </w:rPr>
+              <w:t xml:space="preserve">Contexto de ubicación de la problemática</w:t>
+            </w:r>
+          </w:p>
+          <w:p>
+            <w:pPr>
               <w:numPr>
                 <w:ilvl w:val="0"/>
-                <w:numId w:val="3"/>
+                <w:numId w:val="7"/>
               </w:numPr>
-              <w:pBdr>
-                <w:top w:space="0" w:sz="0" w:val="nil"/>
-                <w:left w:space="0" w:sz="0" w:val="nil"/>
-                <w:bottom w:space="0" w:sz="0" w:val="nil"/>
-                <w:right w:space="0" w:sz="0" w:val="nil"/>
-                <w:between w:space="0" w:sz="0" w:val="nil"/>
-              </w:pBdr>
-              <w:shd w:fill="auto" w:val="clear"/>
-              <w:spacing w:after="0" w:before="0" w:line="259" w:lineRule="auto"/>
-              <w:ind w:left="720" w:right="0" w:hanging="360"/>
-              <w:jc w:val="both"/>
-              <w:rPr>
-                <w:b w:val="0"/>
-                <w:bCs w:val="0"/>
-                <w:i w:val="1"/>
-                <w:iCs w:val="1"/>
-                <w:smallCaps w:val="0"/>
-                <w:strike w:val="0"/>
-                <w:color w:val="548dd4"/>
-                <w:sz w:val="20"/>
-                <w:szCs w:val="20"/>
-                <w:u w:val="none"/>
-                <w:shd w:fill="auto" w:val="clear"/>
-                <w:vertAlign w:val="baseline"/>
-              </w:rPr>
-            </w:pPr>
-            <w:r>
-              <w:rPr>
-                <w:rFonts w:ascii="Calibri" w:cs="Calibri" w:eastAsia="Calibri" w:hAnsi="Calibri"/>
-                <w:b w:val="0"/>
-                <w:bCs w:val="0"/>
-                <w:i w:val="1"/>
-                <w:iCs w:val="1"/>
-                <w:smallCaps w:val="0"/>
-                <w:strike w:val="0"/>
-                <w:color w:val="548dd4"/>
-                <w:sz w:val="20"/>
-                <w:szCs w:val="20"/>
-                <w:u w:val="none"/>
-                <w:shd w:fill="auto" w:val="clear"/>
-                <w:vertAlign w:val="baseline"/>
-                <w:rtl w:val="0"/>
-              </w:rPr>
-              <w:t xml:space="preserve">¿Por qué escogiste este tema? ¿Por qué es relevante este tema para el campo laboral de tu carrera?</w:t>
-            </w:r>
-          </w:p>
-          <w:p>
-            <w:pPr>
-              <w:keepNext w:val="0"/>
-              <w:keepLines w:val="0"/>
-              <w:pageBreakBefore w:val="0"/>
-              <w:widowControl w:val="1"/>
+              <w:spacing w:after="0" w:afterAutospacing="0" w:line="276" w:lineRule="auto"/>
+              <w:ind w:left="720" w:hanging="360"/>
+              <w:rPr/>
+            </w:pPr>
+            <w:r>
+              <w:rPr>
+                <w:rtl w:val="0"/>
+              </w:rPr>
+              <w:t xml:space="preserve">El proyecto se sitúa en el sector inmobiliario y de administración de edificios, un área que requiere con urgencia modernización y auditoría transparente</w:t>
+            </w:r>
+            <w:r>
+              <w:rPr>
+                <w:b w:val="1"/>
+                <w:bCs w:val="1"/>
+                <w:rtl w:val="0"/>
+              </w:rPr>
+              <w:t xml:space="preserve">.</w:t>
+            </w:r>
+            <w:r>
+              <w:rPr>
+                <w:rtl w:val="0"/>
+              </w:rPr>
+              <w:t xml:space="preserve"> (Región Metropolitana y principales comunas con alta densidad de copropiedad inmobiliaria).</w:t>
+            </w:r>
+          </w:p>
+          <w:p>
+            <w:pPr>
               <w:numPr>
                 <w:ilvl w:val="0"/>
-                <w:numId w:val="3"/>
+                <w:numId w:val="7"/>
               </w:numPr>
-              <w:pBdr>
-                <w:top w:space="0" w:sz="0" w:val="nil"/>
-                <w:left w:space="0" w:sz="0" w:val="nil"/>
-                <w:bottom w:space="0" w:sz="0" w:val="nil"/>
-                <w:right w:space="0" w:sz="0" w:val="nil"/>
-                <w:between w:space="0" w:sz="0" w:val="nil"/>
-              </w:pBdr>
-              <w:shd w:fill="auto" w:val="clear"/>
-              <w:spacing w:after="0" w:before="0" w:line="259" w:lineRule="auto"/>
-              <w:ind w:left="720" w:right="0" w:hanging="360"/>
-              <w:jc w:val="both"/>
-              <w:rPr>
-                <w:b w:val="1"/>
-                <w:bCs w:val="1"/>
-                <w:i w:val="1"/>
-                <w:iCs w:val="1"/>
-                <w:smallCaps w:val="0"/>
-                <w:strike w:val="0"/>
-                <w:color w:val="548dd4"/>
-                <w:sz w:val="20"/>
-                <w:szCs w:val="20"/>
-                <w:u w:val="none"/>
-                <w:shd w:fill="auto" w:val="clear"/>
-                <w:vertAlign w:val="baseline"/>
-              </w:rPr>
-            </w:pPr>
-            <w:r>
-              <w:rPr>
-                <w:rFonts w:ascii="Calibri" w:cs="Calibri" w:eastAsia="Calibri" w:hAnsi="Calibri"/>
-                <w:b w:val="0"/>
-                <w:bCs w:val="0"/>
-                <w:i w:val="1"/>
-                <w:iCs w:val="1"/>
-                <w:smallCaps w:val="0"/>
-                <w:strike w:val="0"/>
-                <w:color w:val="548dd4"/>
-                <w:sz w:val="20"/>
-                <w:szCs w:val="20"/>
-                <w:u w:val="none"/>
-                <w:shd w:fill="auto" w:val="clear"/>
-                <w:vertAlign w:val="baseline"/>
-                <w:rtl w:val="0"/>
-              </w:rPr>
-              <w:t xml:space="preserve">¿Dónde se ubica la situación que vas a abordar? (Ej.: País, región, comuna o institución) ¿Cuáles son las características principales de ese lugar? </w:t>
-            </w:r>
-            <w:r>
-              <w:rPr>
-                <w:rtl w:val="0"/>
-              </w:rPr>
-            </w:r>
-          </w:p>
-          <w:p>
-            <w:pPr>
-              <w:keepNext w:val="0"/>
-              <w:keepLines w:val="0"/>
-              <w:pageBreakBefore w:val="0"/>
-              <w:widowControl w:val="1"/>
+              <w:spacing w:after="240" w:line="276" w:lineRule="auto"/>
+              <w:ind w:left="720" w:hanging="360"/>
+              <w:rPr/>
+            </w:pPr>
+            <w:r>
+              <w:rPr>
+                <w:rtl w:val="0"/>
+              </w:rPr>
+              <w:t xml:space="preserve">Condominios y edificios de departamentos regulados por la Ley N° 21.442 de Copropiedad Inmobiliaria, caracterizados por alta concurrencia de personas, necesidad de auditoría financiera periódica y requerimientos de comunicación inmediata entre la administración y los residentes.</w:t>
+            </w:r>
+          </w:p>
+          <w:p>
+            <w:pPr>
+              <w:spacing w:after="240" w:line="276" w:lineRule="auto"/>
+              <w:rPr>
+                <w:b w:val="1"/>
+                <w:bCs w:val="1"/>
+              </w:rPr>
+            </w:pPr>
+            <w:r>
+              <w:rPr>
+                <w:b w:val="1"/>
+                <w:bCs w:val="1"/>
+                <w:rtl w:val="0"/>
+              </w:rPr>
+              <w:t xml:space="preserve">Actores impactados</w:t>
+            </w:r>
+          </w:p>
+          <w:p>
+            <w:pPr>
               <w:numPr>
                 <w:ilvl w:val="0"/>
-                <w:numId w:val="3"/>
+                <w:numId w:val="13"/>
               </w:numPr>
-              <w:pBdr>
-                <w:top w:space="0" w:sz="0" w:val="nil"/>
-                <w:left w:space="0" w:sz="0" w:val="nil"/>
-                <w:bottom w:space="0" w:sz="0" w:val="nil"/>
-                <w:right w:space="0" w:sz="0" w:val="nil"/>
-                <w:between w:space="0" w:sz="0" w:val="nil"/>
-              </w:pBdr>
-              <w:shd w:fill="auto" w:val="clear"/>
-              <w:spacing w:after="0" w:before="0" w:line="259" w:lineRule="auto"/>
-              <w:ind w:left="720" w:right="0" w:hanging="360"/>
-              <w:jc w:val="both"/>
-              <w:rPr>
-                <w:b w:val="0"/>
-                <w:bCs w:val="0"/>
-                <w:i w:val="1"/>
-                <w:iCs w:val="1"/>
-                <w:smallCaps w:val="0"/>
-                <w:strike w:val="0"/>
-                <w:color w:val="548dd4"/>
-                <w:sz w:val="20"/>
-                <w:szCs w:val="20"/>
-                <w:u w:val="none"/>
-                <w:shd w:fill="auto" w:val="clear"/>
-                <w:vertAlign w:val="baseline"/>
-              </w:rPr>
-            </w:pPr>
-            <w:r>
-              <w:rPr>
-                <w:rFonts w:ascii="Calibri" w:cs="Calibri" w:eastAsia="Calibri" w:hAnsi="Calibri"/>
-                <w:b w:val="0"/>
-                <w:bCs w:val="0"/>
-                <w:i w:val="1"/>
-                <w:iCs w:val="1"/>
-                <w:smallCaps w:val="0"/>
-                <w:strike w:val="0"/>
-                <w:color w:val="548dd4"/>
-                <w:sz w:val="20"/>
-                <w:szCs w:val="20"/>
-                <w:u w:val="none"/>
-                <w:shd w:fill="auto" w:val="clear"/>
-                <w:vertAlign w:val="baseline"/>
-                <w:rtl w:val="0"/>
-              </w:rPr>
-              <w:t xml:space="preserve">¿A quiénes afecta o impacta la situación que vas a abordar? (Ej.: Grupo etario, usuarios de algún servicio, etc.).</w:t>
-            </w:r>
-          </w:p>
-          <w:p>
-            <w:pPr>
-              <w:keepNext w:val="0"/>
-              <w:keepLines w:val="0"/>
-              <w:pageBreakBefore w:val="0"/>
-              <w:widowControl w:val="1"/>
+              <w:spacing w:after="0" w:afterAutospacing="0" w:line="276" w:lineRule="auto"/>
+              <w:ind w:left="720" w:hanging="360"/>
+              <w:rPr/>
+            </w:pPr>
+            <w:r>
+              <w:rPr>
+                <w:b w:val="1"/>
+                <w:bCs w:val="1"/>
+                <w:rtl w:val="0"/>
+              </w:rPr>
+              <w:t xml:space="preserve">Residentes:</w:t>
+            </w:r>
+            <w:r>
+              <w:rPr>
+                <w:rtl w:val="0"/>
+              </w:rPr>
+              <w:t xml:space="preserve"> Propietarios y arrendatarios que requieren inmediatez para revisar cobros, pagar en línea, reservar áreas comunes y autorizar visitas mediante QR.</w:t>
+            </w:r>
+          </w:p>
+          <w:p>
+            <w:pPr>
               <w:numPr>
                 <w:ilvl w:val="0"/>
-                <w:numId w:val="3"/>
+                <w:numId w:val="13"/>
               </w:numPr>
-              <w:pBdr>
-                <w:top w:space="0" w:sz="0" w:val="nil"/>
-                <w:left w:space="0" w:sz="0" w:val="nil"/>
-                <w:bottom w:space="0" w:sz="0" w:val="nil"/>
-                <w:right w:space="0" w:sz="0" w:val="nil"/>
-                <w:between w:space="0" w:sz="0" w:val="nil"/>
-              </w:pBdr>
-              <w:shd w:fill="auto" w:val="clear"/>
-              <w:spacing w:after="160" w:before="0" w:line="259" w:lineRule="auto"/>
-              <w:ind w:left="720" w:right="0" w:hanging="360"/>
-              <w:jc w:val="both"/>
-              <w:rPr>
-                <w:b w:val="0"/>
-                <w:bCs w:val="0"/>
-                <w:i w:val="1"/>
-                <w:iCs w:val="1"/>
-                <w:smallCaps w:val="0"/>
-                <w:strike w:val="0"/>
-                <w:color w:val="548dd4"/>
-                <w:sz w:val="20"/>
-                <w:szCs w:val="20"/>
-                <w:u w:val="none"/>
-                <w:shd w:fill="auto" w:val="clear"/>
-                <w:vertAlign w:val="baseline"/>
-              </w:rPr>
-            </w:pPr>
-            <w:r>
-              <w:rPr>
-                <w:rFonts w:ascii="Calibri" w:cs="Calibri" w:eastAsia="Calibri" w:hAnsi="Calibri"/>
-                <w:b w:val="0"/>
-                <w:bCs w:val="0"/>
-                <w:i w:val="1"/>
-                <w:iCs w:val="1"/>
-                <w:smallCaps w:val="0"/>
-                <w:strike w:val="0"/>
-                <w:color w:val="548dd4"/>
-                <w:sz w:val="20"/>
-                <w:szCs w:val="20"/>
-                <w:u w:val="none"/>
-                <w:shd w:fill="auto" w:val="clear"/>
-                <w:vertAlign w:val="baseline"/>
-                <w:rtl w:val="0"/>
-              </w:rPr>
-              <w:t xml:space="preserve">¿Cuál sería el aporte de valor (real o simulado) de tu Proyecto APT para el contexto laboral y/o social en que se situaría?</w:t>
+              <w:spacing w:after="0" w:afterAutospacing="0" w:line="276" w:lineRule="auto"/>
+              <w:ind w:left="720" w:hanging="360"/>
+              <w:rPr/>
+            </w:pPr>
+            <w:r>
+              <w:rPr>
+                <w:b w:val="1"/>
+                <w:bCs w:val="1"/>
+                <w:rtl w:val="0"/>
+              </w:rPr>
+              <w:t xml:space="preserve">Conserjería y personal de seguridad:</w:t>
+            </w:r>
+            <w:r>
+              <w:rPr>
+                <w:rtl w:val="0"/>
+              </w:rPr>
+              <w:t xml:space="preserve"> Operadores que necesitan agilizar el flujo de entrada de visitas, recepción de paquetes y registro de incidencias sin procesos manuales.</w:t>
+            </w:r>
+          </w:p>
+          <w:p>
+            <w:pPr>
+              <w:numPr>
+                <w:ilvl w:val="0"/>
+                <w:numId w:val="13"/>
+              </w:numPr>
+              <w:spacing w:after="240" w:line="276" w:lineRule="auto"/>
+              <w:ind w:left="720" w:hanging="360"/>
+              <w:rPr/>
+            </w:pPr>
+            <w:r>
+              <w:rPr>
+                <w:b w:val="1"/>
+                <w:bCs w:val="1"/>
+                <w:rtl w:val="0"/>
+              </w:rPr>
+              <w:t xml:space="preserve">Administradores y comités de administración:</w:t>
+            </w:r>
+            <w:r>
+              <w:rPr>
+                <w:rtl w:val="0"/>
+              </w:rPr>
+              <w:t xml:space="preserve"> Gestores que buscan centralizar la contabilidad, monitorear la morosidad y emitir reportes auditables en tiempo real.</w:t>
+            </w:r>
+          </w:p>
+          <w:p>
+            <w:pPr>
+              <w:spacing w:after="240" w:line="276" w:lineRule="auto"/>
+              <w:rPr>
+                <w:b w:val="1"/>
+                <w:bCs w:val="1"/>
+              </w:rPr>
+            </w:pPr>
+            <w:r>
+              <w:rPr>
+                <w:b w:val="1"/>
+                <w:bCs w:val="1"/>
+                <w:rtl w:val="0"/>
+              </w:rPr>
+              <w:t xml:space="preserve">Aporte de valor para el contexto laboral y social</w:t>
+            </w:r>
+          </w:p>
+          <w:p>
+            <w:pPr>
+              <w:numPr>
+                <w:ilvl w:val="0"/>
+                <w:numId w:val="4"/>
+              </w:numPr>
+              <w:spacing w:after="0" w:afterAutospacing="0" w:line="276" w:lineRule="auto"/>
+              <w:ind w:left="720" w:hanging="360"/>
+              <w:rPr/>
+            </w:pPr>
+            <w:r>
+              <w:rPr>
+                <w:b w:val="1"/>
+                <w:bCs w:val="1"/>
+                <w:rtl w:val="0"/>
+              </w:rPr>
+              <w:t xml:space="preserve">Aporte Social:</w:t>
+            </w:r>
+            <w:r>
+              <w:rPr>
+                <w:rtl w:val="0"/>
+              </w:rPr>
+              <w:t xml:space="preserve"> Fomenta la transparencia comunitaria, mitiga disputas vecinales derivadas de cobros imprecisos y reduce los tiempos de espera en conserjería, elevando los estándares de seguridad y convivencia.</w:t>
+            </w:r>
+          </w:p>
+          <w:p>
+            <w:pPr>
+              <w:numPr>
+                <w:ilvl w:val="0"/>
+                <w:numId w:val="4"/>
+              </w:numPr>
+              <w:spacing w:after="0" w:afterAutospacing="0" w:line="276" w:lineRule="auto"/>
+              <w:ind w:left="720" w:hanging="360"/>
+              <w:rPr/>
+            </w:pPr>
+            <w:r>
+              <w:rPr>
+                <w:b w:val="1"/>
+                <w:bCs w:val="1"/>
+                <w:rtl w:val="0"/>
+              </w:rPr>
+              <w:t xml:space="preserve">Accesos AIoT y Códigos QR:</w:t>
+            </w:r>
+            <w:r>
+              <w:rPr>
+                <w:rtl w:val="0"/>
+              </w:rPr>
+              <w:t xml:space="preserve"> El mayor aporte operativo es la eliminación de filas en portería. Los residentes crean y comparten códigos QR desde su app; al llegar la visita, el conserje lo escanea y los datos se escriben automáticamente en la base de datos sin esperas. Esto se potencia con hardware en el borde (AIoT) para la lectura automatizada de patentes vehiculares mediante cámaras. </w:t>
+            </w:r>
+          </w:p>
+          <w:p>
+            <w:pPr>
+              <w:numPr>
+                <w:ilvl w:val="0"/>
+                <w:numId w:val="4"/>
+              </w:numPr>
+              <w:spacing w:after="240" w:line="276" w:lineRule="auto"/>
+              <w:ind w:left="720" w:hanging="360"/>
+              <w:rPr/>
+            </w:pPr>
+            <w:r>
+              <w:rPr>
+                <w:b w:val="1"/>
+                <w:bCs w:val="1"/>
+                <w:rtl w:val="0"/>
+              </w:rPr>
+              <w:t xml:space="preserve">Ecosistema Seguro y en Tiempo Real:</w:t>
+            </w:r>
+            <w:r>
+              <w:rPr>
+                <w:rtl w:val="0"/>
+              </w:rPr>
+              <w:t xml:space="preserve"> El sistema reemplaza la burocracia por notificaciones instantáneas, flujos financieros atómicos con Transbank y una arquitectura multi-tenant robusta y escalable. </w:t>
+            </w:r>
+            <w:r>
+              <w:rPr>
+                <w:rtl w:val="0"/>
+              </w:rPr>
             </w:r>
           </w:p>
         </w:tc>
@@ -1652,28 +1771,148 @@
           </w:tcPr>
           <w:p>
             <w:pPr>
-              <w:jc w:val="both"/>
-              <w:rPr>
-                <w:rFonts w:ascii="Calibri" w:cs="Calibri" w:eastAsia="Calibri" w:hAnsi="Calibri"/>
-                <w:i w:val="1"/>
-                <w:iCs w:val="1"/>
-                <w:color w:val="548dd4"/>
-                <w:sz w:val="20"/>
-                <w:szCs w:val="20"/>
-                <w:highlight w:val="cyan"/>
-              </w:rPr>
-            </w:pPr>
-            <w:r>
-              <w:rPr>
-                <w:rFonts w:ascii="Calibri" w:cs="Calibri" w:eastAsia="Calibri" w:hAnsi="Calibri"/>
-                <w:i w:val="1"/>
-                <w:iCs w:val="1"/>
-                <w:color w:val="548dd4"/>
-                <w:sz w:val="20"/>
-                <w:szCs w:val="20"/>
-                <w:rtl w:val="0"/>
-              </w:rPr>
-              <w:t xml:space="preserve">Señala qué se espera lograr con el proyecto (objetivo) y describe brevemente en qué consistiría, cómo planeas abordar la problemática presentada en el apartado anterior. </w:t>
+              <w:spacing w:line="276" w:lineRule="auto"/>
+              <w:jc w:val="both"/>
+              <w:rPr/>
+            </w:pPr>
+            <w:r>
+              <w:rPr>
+                <w:rtl w:val="0"/>
+              </w:rPr>
+              <w:t xml:space="preserve">El proyecto consiste en una solución de software de arquitectura distribuida construida sobre un backend robusto (Python, Django REST Framework y PostgreSQL) que expone servicios tanto a una consola web administrativa como a una aplicación móvil multiplataforma. Abordamos los problemas operativos de la siguiente manera:</w:t>
+            </w:r>
+          </w:p>
+          <w:p>
+            <w:pPr>
+              <w:numPr>
+                <w:ilvl w:val="0"/>
+                <w:numId w:val="8"/>
+              </w:numPr>
+              <w:spacing w:after="0" w:afterAutospacing="0" w:line="276" w:lineRule="auto"/>
+              <w:ind w:left="720" w:hanging="360"/>
+            </w:pPr>
+            <w:r>
+              <w:rPr>
+                <w:b w:val="1"/>
+                <w:bCs w:val="1"/>
+                <w:rtl w:val="0"/>
+              </w:rPr>
+              <w:t xml:space="preserve">Aplicación Móvil, Códigos QR y Autogestión:</w:t>
+            </w:r>
+            <w:r>
+              <w:rPr>
+                <w:rtl w:val="0"/>
+              </w:rPr>
+              <w:t xml:space="preserve"> Para erradicar el cuello de botella y la inseguridad del registro manual en portería, los residentes utilizan una app móvil desde donde pueden pagar cuentas, reservar espacios y generar códigos QR dinámicos para sus visitas. Al llegar la visita, el conserje utiliza un apartado específico en su propia app móvil para escanear el QR, validando la identidad e inscribiendo el registro automáticamente en la base de datos sin tiempos de espera.</w:t>
+            </w:r>
+          </w:p>
+          <w:p>
+            <w:pPr>
+              <w:numPr>
+                <w:ilvl w:val="0"/>
+                <w:numId w:val="8"/>
+              </w:numPr>
+              <w:spacing w:after="0" w:afterAutospacing="0" w:line="276" w:lineRule="auto"/>
+              <w:ind w:left="720" w:hanging="360"/>
+            </w:pPr>
+            <w:r>
+              <w:rPr>
+                <w:b w:val="1"/>
+                <w:bCs w:val="1"/>
+                <w:rtl w:val="0"/>
+              </w:rPr>
+              <w:t xml:space="preserve">Infraestructura AIoT (Visión Computacional):</w:t>
+            </w:r>
+            <w:r>
+              <w:rPr>
+                <w:rtl w:val="0"/>
+              </w:rPr>
+              <w:t xml:space="preserve"> Este control de acceso se potencia integrando hardware en el borde (AIoT) equipado con cámaras para la lectura automatizada de patentes vehiculares, permitiendo un ingreso fluido y auditado al recinto.</w:t>
+            </w:r>
+          </w:p>
+          <w:p>
+            <w:pPr>
+              <w:numPr>
+                <w:ilvl w:val="0"/>
+                <w:numId w:val="8"/>
+              </w:numPr>
+              <w:spacing w:after="0" w:afterAutospacing="0" w:line="276" w:lineRule="auto"/>
+              <w:ind w:left="720" w:hanging="360"/>
+            </w:pPr>
+            <w:r>
+              <w:rPr>
+                <w:b w:val="1"/>
+                <w:bCs w:val="1"/>
+                <w:rtl w:val="0"/>
+              </w:rPr>
+              <w:t xml:space="preserve">Motor Financiero Automatizado:</w:t>
+            </w:r>
+            <w:r>
+              <w:rPr>
+                <w:rtl w:val="0"/>
+              </w:rPr>
+              <w:t xml:space="preserve"> Eliminamos las planillas de Excel mediante un motor de base de datos relacional que calcula y prorratea automáticamente los gastos comunes. Integramos transacciones directas mediante Transbank Webpay Plus SDK para pagos seguros en línea y conciliación bancaria.</w:t>
+            </w:r>
+          </w:p>
+          <w:p>
+            <w:pPr>
+              <w:numPr>
+                <w:ilvl w:val="0"/>
+                <w:numId w:val="8"/>
+              </w:numPr>
+              <w:spacing w:after="0" w:afterAutospacing="0" w:line="276" w:lineRule="auto"/>
+              <w:ind w:left="720" w:hanging="360"/>
+            </w:pPr>
+            <w:r>
+              <w:rPr>
+                <w:b w:val="1"/>
+                <w:bCs w:val="1"/>
+                <w:rtl w:val="0"/>
+              </w:rPr>
+              <w:t xml:space="preserve">Gestión Contextualizada:</w:t>
+            </w:r>
+            <w:r>
+              <w:rPr>
+                <w:rtl w:val="0"/>
+              </w:rPr>
+              <w:t xml:space="preserve"> La plataforma implementa un control de acceso basado en roles (RBAC) con interfaces independientes. Los administradores cuentan con un panel gerencial web protegido para gestionar múltiples condominios, mientras que residentes y conserjes operan desde la agilidad de sus dispositivos móviles.</w:t>
+            </w:r>
+          </w:p>
+          <w:p>
+            <w:pPr>
+              <w:numPr>
+                <w:ilvl w:val="0"/>
+                <w:numId w:val="8"/>
+              </w:numPr>
+              <w:spacing w:after="240" w:line="276" w:lineRule="auto"/>
+              <w:ind w:left="720" w:hanging="360"/>
+            </w:pPr>
+            <w:r>
+              <w:rPr>
+                <w:b w:val="1"/>
+                <w:bCs w:val="1"/>
+                <w:rtl w:val="0"/>
+              </w:rPr>
+              <w:t xml:space="preserve">Inteligencia Artificial Integrada:</w:t>
+            </w:r>
+            <w:r>
+              <w:rPr>
+                <w:rtl w:val="0"/>
+              </w:rPr>
+              <w:t xml:space="preserve"> Agregamos una capa de IA Generativa con arquitectura RAG (Retrieval-Augmented Generation) para responder dudas legales o normativas de los residentes basándose automáticamente en los reglamentos internos.</w:t>
+            </w:r>
+          </w:p>
+          <w:p>
+            <w:pPr>
+              <w:spacing w:after="240" w:line="276" w:lineRule="auto"/>
+              <w:jc w:val="both"/>
+              <w:rPr/>
+            </w:pPr>
+            <w:r>
+              <w:rPr>
+                <w:rtl w:val="0"/>
+              </w:rPr>
+              <w:t xml:space="preserve">Esta arquitectura demuestra un dominio completo del stack Full-Stack y móvil, garantizando escalabilidad, seguridad en tiempo real y una experiencia de usuario (UX) sin fricciones.</w:t>
             </w:r>
             <w:r>
               <w:rPr>
@@ -1716,53 +1955,268 @@
           </w:tcPr>
           <w:p>
             <w:pPr>
-              <w:jc w:val="both"/>
-              <w:rPr>
-                <w:rFonts w:ascii="Calibri" w:cs="Calibri" w:eastAsia="Calibri" w:hAnsi="Calibri"/>
-                <w:i w:val="1"/>
-                <w:iCs w:val="1"/>
-                <w:color w:val="548dd4"/>
-                <w:sz w:val="20"/>
-                <w:szCs w:val="20"/>
-              </w:rPr>
-            </w:pPr>
-            <w:r>
-              <w:rPr>
-                <w:rFonts w:ascii="Calibri" w:cs="Calibri" w:eastAsia="Calibri" w:hAnsi="Calibri"/>
-                <w:i w:val="1"/>
-                <w:iCs w:val="1"/>
-                <w:color w:val="548dd4"/>
-                <w:sz w:val="20"/>
-                <w:szCs w:val="20"/>
-                <w:rtl w:val="0"/>
-              </w:rPr>
-              <w:t xml:space="preserve">Justifica cómo se relaciona tu Proyecto APT con el perfil de egreso de tu carrera y, en particular, con las competencias del perfil de egreso que seleccionaste anteriormente. </w:t>
-            </w:r>
-          </w:p>
-          <w:p>
-            <w:pPr>
-              <w:jc w:val="both"/>
-              <w:rPr>
-                <w:rFonts w:ascii="Calibri" w:cs="Calibri" w:eastAsia="Calibri" w:hAnsi="Calibri"/>
-                <w:i w:val="1"/>
-                <w:iCs w:val="1"/>
-                <w:color w:val="548dd4"/>
-                <w:sz w:val="20"/>
-                <w:szCs w:val="20"/>
-                <w:highlight w:val="yellow"/>
-              </w:rPr>
-            </w:pPr>
-            <w:r>
-              <w:rPr>
-                <w:rFonts w:ascii="Calibri" w:cs="Calibri" w:eastAsia="Calibri" w:hAnsi="Calibri"/>
-                <w:i w:val="1"/>
-                <w:iCs w:val="1"/>
-                <w:color w:val="548dd4"/>
-                <w:sz w:val="20"/>
-                <w:szCs w:val="20"/>
-                <w:rtl w:val="0"/>
-              </w:rPr>
-              <w:t xml:space="preserve">¿De qué manera se relaciona el Proyecto APT con el perfil de egreso de tu carrera? ¿De qué manera son necesarias las competencias que seleccionaste para resolver la problemática a trabajar? </w:t>
+              <w:spacing w:after="240" w:line="276" w:lineRule="auto"/>
+              <w:jc w:val="both"/>
+              <w:rPr>
+                <w:b w:val="1"/>
+                <w:bCs w:val="1"/>
+              </w:rPr>
+            </w:pPr>
+            <w:r>
+              <w:rPr>
+                <w:b w:val="1"/>
+                <w:bCs w:val="1"/>
+                <w:rtl w:val="0"/>
+              </w:rPr>
+              <w:t xml:space="preserve">Relación Directa con el Perfil de Egreso</w:t>
+            </w:r>
+          </w:p>
+          <w:p>
+            <w:pPr>
+              <w:numPr>
+                <w:ilvl w:val="0"/>
+                <w:numId w:val="5"/>
+              </w:numPr>
+              <w:spacing w:after="0" w:afterAutospacing="0" w:line="276" w:lineRule="auto"/>
+              <w:ind w:left="720" w:hanging="360"/>
+              <w:rPr>
+                <w:rFonts w:ascii="Calibri" w:cs="Calibri" w:eastAsia="Calibri" w:hAnsi="Calibri"/>
+              </w:rPr>
+            </w:pPr>
+            <w:r>
+              <w:rPr>
+                <w:rtl w:val="0"/>
+              </w:rPr>
+              <w:t xml:space="preserve">La problemática demanda orquestar múltiples capas tecnológicas: un backend robusto en la nube, aplicaciones móviles para la autogestión de usuarios y procesamiento de visión computacional en el borde (Edge Computing).</w:t>
+            </w:r>
+          </w:p>
+          <w:p>
+            <w:pPr>
+              <w:numPr>
+                <w:ilvl w:val="0"/>
+                <w:numId w:val="5"/>
+              </w:numPr>
+              <w:spacing w:after="240" w:line="276" w:lineRule="auto"/>
+              <w:ind w:left="720" w:hanging="360"/>
+              <w:rPr>
+                <w:rFonts w:ascii="Calibri" w:cs="Calibri" w:eastAsia="Calibri" w:hAnsi="Calibri"/>
+              </w:rPr>
+            </w:pPr>
+            <w:r>
+              <w:rPr>
+                <w:rtl w:val="0"/>
+              </w:rPr>
+              <w:t xml:space="preserve">Dominar esta complejidad técnica evidencia la capacidad analítica y de desarrollo Full-Stack requerida por la industria actual, validando la habilidad para asegurar la continuidad operativa e integrar sistemas multiplataforma.</w:t>
+            </w:r>
+          </w:p>
+          <w:p>
+            <w:pPr>
+              <w:spacing w:after="240" w:line="276" w:lineRule="auto"/>
+              <w:jc w:val="both"/>
+              <w:rPr>
+                <w:b w:val="1"/>
+                <w:bCs w:val="1"/>
+              </w:rPr>
+            </w:pPr>
+            <w:r>
+              <w:rPr>
+                <w:b w:val="1"/>
+                <w:bCs w:val="1"/>
+                <w:rtl w:val="0"/>
+              </w:rPr>
+              <w:t xml:space="preserve">Necesidad de las Competencias Seleccionadas</w:t>
+            </w:r>
+          </w:p>
+          <w:p>
+            <w:pPr>
+              <w:numPr>
+                <w:ilvl w:val="0"/>
+                <w:numId w:val="11"/>
+              </w:numPr>
+              <w:spacing w:after="0" w:afterAutospacing="0" w:line="276" w:lineRule="auto"/>
+              <w:ind w:left="720" w:hanging="360"/>
+            </w:pPr>
+            <w:r>
+              <w:rPr>
+                <w:b w:val="1"/>
+                <w:bCs w:val="1"/>
+                <w:rtl w:val="0"/>
+              </w:rPr>
+              <w:t xml:space="preserve">Ofrecer Propuestas de Solución Informática Analizando Procesos Integrales:</w:t>
+            </w:r>
+            <w:r>
+              <w:rPr>
+                <w:rtl w:val="0"/>
+              </w:rPr>
+              <w:t xml:space="preserve"> Permite analizar en profundidad los flujos operacionales tradicionales y deficientes de los condominios (planillas manuales, cobros no conciliados y fricción en portería) para estructurar una solución tecnológica integral SaaS y móvil que responda con exactitud a los requerimientos de residentes, conserjes y comités de administración.</w:t>
+            </w:r>
+          </w:p>
+          <w:p>
+            <w:pPr>
+              <w:numPr>
+                <w:ilvl w:val="0"/>
+                <w:numId w:val="11"/>
+              </w:numPr>
+              <w:spacing w:after="0" w:afterAutospacing="0" w:line="276" w:lineRule="auto"/>
+              <w:ind w:left="720" w:hanging="360"/>
+            </w:pPr>
+            <w:r>
+              <w:rPr>
+                <w:b w:val="1"/>
+                <w:bCs w:val="1"/>
+                <w:rtl w:val="0"/>
+              </w:rPr>
+              <w:t xml:space="preserve">Construcción del Modelo Arquitectónico de una Solución Sistémica:</w:t>
+            </w:r>
+            <w:r>
+              <w:rPr>
+                <w:rtl w:val="0"/>
+              </w:rPr>
+              <w:t xml:space="preserve"> Es fundamental para diseñar una arquitectura distribuida desacoplada bajo el enfoque API-First (Django REST Framework), garantizando que un backend centralizado exponga servicios de forma segura, concurrente y escalable hacia la plataforma web administrativa, las aplicaciones móviles y el hardware en el borde.</w:t>
+            </w:r>
+          </w:p>
+          <w:p>
+            <w:pPr>
+              <w:numPr>
+                <w:ilvl w:val="0"/>
+                <w:numId w:val="11"/>
+              </w:numPr>
+              <w:spacing w:after="0" w:afterAutospacing="0" w:line="276" w:lineRule="auto"/>
+              <w:ind w:left="720" w:hanging="360"/>
+            </w:pPr>
+            <w:r>
+              <w:rPr>
+                <w:b w:val="1"/>
+                <w:bCs w:val="1"/>
+                <w:rtl w:val="0"/>
+              </w:rPr>
+              <w:t xml:space="preserve">Construcción de Programas y Rutinas de Variada Complejidad:</w:t>
+            </w:r>
+            <w:r>
+              <w:rPr>
+                <w:rtl w:val="0"/>
+              </w:rPr>
+              <w:t xml:space="preserve"> Resulta indispensable para codificar la lógica crítica de negocio bajo estándares de código limpio (Clean Code), tales como el algoritmo de generación dinámica de códigos QR temporales desde la app móvil, el motor de prorrateo financiero y la integración con el SDK de Transbank Webpay Plus.</w:t>
+            </w:r>
+          </w:p>
+          <w:p>
+            <w:pPr>
+              <w:numPr>
+                <w:ilvl w:val="0"/>
+                <w:numId w:val="11"/>
+              </w:numPr>
+              <w:spacing w:after="0" w:afterAutospacing="0" w:line="276" w:lineRule="auto"/>
+              <w:ind w:left="720" w:hanging="360"/>
+            </w:pPr>
+            <w:r>
+              <w:rPr>
+                <w:b w:val="1"/>
+                <w:bCs w:val="1"/>
+                <w:rtl w:val="0"/>
+              </w:rPr>
+              <w:t xml:space="preserve">Programación de Consultas y Manipulación de Bases de Datos:</w:t>
+            </w:r>
+            <w:r>
+              <w:rPr>
+                <w:rtl w:val="0"/>
+              </w:rPr>
+              <w:t xml:space="preserve"> Es necesaria para optimizar el acceso y persistencia de los datos mediante el ORM de Django, asegurando alta eficiencia y mínima latencia al procesar cálculos masivos de cobros, reportes contables e inscripciones de accesos vehiculares en tiempo real.</w:t>
+            </w:r>
+          </w:p>
+          <w:p>
+            <w:pPr>
+              <w:numPr>
+                <w:ilvl w:val="0"/>
+                <w:numId w:val="11"/>
+              </w:numPr>
+              <w:spacing w:after="0" w:afterAutospacing="0" w:line="276" w:lineRule="auto"/>
+              <w:ind w:left="720" w:hanging="360"/>
+            </w:pPr>
+            <w:r>
+              <w:rPr>
+                <w:b w:val="1"/>
+                <w:bCs w:val="1"/>
+                <w:rtl w:val="0"/>
+              </w:rPr>
+              <w:t xml:space="preserve">Calidad y Pruebas de Certificación (QA / Pytest):</w:t>
+            </w:r>
+            <w:r>
+              <w:rPr>
+                <w:rtl w:val="0"/>
+              </w:rPr>
+              <w:t xml:space="preserve"> Permite certificar la fiabilidad y robustez del software mediante el diseño e implementación de suites de pruebas automatizadas (unitarias y de integración) con Pytest, evitando regresiones en flujos críticos como la liquidación de gastos comunes, la validación de pagos y las reservas de espacios sin traslape.</w:t>
+            </w:r>
+          </w:p>
+          <w:p>
+            <w:pPr>
+              <w:numPr>
+                <w:ilvl w:val="0"/>
+                <w:numId w:val="11"/>
+              </w:numPr>
+              <w:spacing w:after="0" w:afterAutospacing="0" w:line="276" w:lineRule="auto"/>
+              <w:ind w:left="720" w:hanging="360"/>
+            </w:pPr>
+            <w:r>
+              <w:rPr>
+                <w:b w:val="1"/>
+                <w:bCs w:val="1"/>
+                <w:rtl w:val="0"/>
+              </w:rPr>
+              <w:t xml:space="preserve">Seguridad y Resolución de Vulnerabilidades Sistémicas:</w:t>
+            </w:r>
+            <w:r>
+              <w:rPr>
+                <w:rtl w:val="0"/>
+              </w:rPr>
+              <w:t xml:space="preserve"> Es crítica para blindar el ecosistema bajo las directrices OWASP Top 10, implementando autenticación robusta por JWT para los endpoints móviles, control de acceso basado en roles (RBAC) y transacciones atómicas seguras que protejan la integridad financiera ante fallos o intentos de manipulación.</w:t>
+            </w:r>
+          </w:p>
+          <w:p>
+            <w:pPr>
+              <w:numPr>
+                <w:ilvl w:val="0"/>
+                <w:numId w:val="11"/>
+              </w:numPr>
+              <w:spacing w:after="0" w:afterAutospacing="0" w:line="276" w:lineRule="auto"/>
+              <w:ind w:left="720" w:hanging="360"/>
+            </w:pPr>
+            <w:r>
+              <w:rPr>
+                <w:b w:val="1"/>
+                <w:bCs w:val="1"/>
+                <w:rtl w:val="0"/>
+              </w:rPr>
+              <w:t xml:space="preserve">Gestión de Proyectos Informáticos:</w:t>
+            </w:r>
+            <w:r>
+              <w:rPr>
+                <w:rtl w:val="0"/>
+              </w:rPr>
+              <w:t xml:space="preserve"> Permite orquestar el ciclo de desarrollo aplicando el marco ágil Scrum, evaluando alternativas técnicas, definiendo la división del trabajo entre módulos web, móviles y hardware, y administrando el backlog para garantizar la entrega del MVP en los plazos académicos y operacionales establecidos.</w:t>
+            </w:r>
+          </w:p>
+          <w:p>
+            <w:pPr>
+              <w:numPr>
+                <w:ilvl w:val="0"/>
+                <w:numId w:val="11"/>
+              </w:numPr>
+              <w:spacing w:after="240" w:line="276" w:lineRule="auto"/>
+              <w:ind w:left="720" w:hanging="360"/>
+            </w:pPr>
+            <w:r>
+              <w:rPr>
+                <w:b w:val="1"/>
+                <w:bCs w:val="1"/>
+                <w:rtl w:val="0"/>
+              </w:rPr>
+              <w:t xml:space="preserve">Transformación de Grandes Volúmenes de Datos e Inteligencia de Negocios:</w:t>
+            </w:r>
+            <w:r>
+              <w:rPr>
+                <w:rtl w:val="0"/>
+              </w:rPr>
+              <w:t xml:space="preserve"> Resulta indispensable para consolidar analíticas de recaudación versus morosidad en paneles visuales, así como para implementar la arquitectura de IA Generativa (RAG) que indexa y vectoriza los reglamentos internos, convirtiendo grandes volúmenes documentales en respuestas normativas instantáneas para apoyar la toma de decisiones.</w:t>
             </w:r>
             <w:r>
               <w:rPr>
@@ -1805,53 +2259,273 @@
           </w:tcPr>
           <w:p>
             <w:pPr>
-              <w:jc w:val="both"/>
-              <w:rPr>
-                <w:rFonts w:ascii="Calibri" w:cs="Calibri" w:eastAsia="Calibri" w:hAnsi="Calibri"/>
+              <w:spacing w:after="240" w:line="276" w:lineRule="auto"/>
+              <w:jc w:val="both"/>
+              <w:rPr>
+                <w:b w:val="1"/>
+                <w:bCs w:val="1"/>
+              </w:rPr>
+            </w:pPr>
+            <w:r>
+              <w:rPr>
+                <w:b w:val="1"/>
+                <w:bCs w:val="1"/>
+                <w:rtl w:val="0"/>
+              </w:rPr>
+              <w:t xml:space="preserve">Intereses Profesionales del Equipo</w:t>
+            </w:r>
+          </w:p>
+          <w:p>
+            <w:pPr>
+              <w:numPr>
+                <w:ilvl w:val="0"/>
+                <w:numId w:val="3"/>
+              </w:numPr>
+              <w:spacing w:after="0" w:afterAutospacing="0" w:line="276" w:lineRule="auto"/>
+              <w:ind w:left="720" w:hanging="360"/>
+              <w:rPr>
+                <w:rFonts w:ascii="Calibri" w:cs="Calibri" w:eastAsia="Calibri" w:hAnsi="Calibri"/>
+              </w:rPr>
+            </w:pPr>
+            <w:r>
+              <w:rPr>
+                <w:rtl w:val="0"/>
+              </w:rPr>
+              <w:t xml:space="preserve">Nuestros intereses profesionales convergen en el Desarrollo de Software Full-Stack, el diseño de Arquitecturas Cloud escalables y la integración de tecnologías emergentes (AIoT, visión computacional e Inteligencia Artificial Generativa) en productos digitales de impacto real.</w:t>
+            </w:r>
+          </w:p>
+          <w:p>
+            <w:pPr>
+              <w:numPr>
+                <w:ilvl w:val="0"/>
+                <w:numId w:val="3"/>
+              </w:numPr>
+              <w:spacing w:after="240" w:line="276" w:lineRule="auto"/>
+              <w:ind w:left="720" w:hanging="360"/>
+              <w:rPr>
+                <w:rFonts w:ascii="Calibri" w:cs="Calibri" w:eastAsia="Calibri" w:hAnsi="Calibri"/>
+              </w:rPr>
+            </w:pPr>
+            <w:r>
+              <w:rPr>
+                <w:rtl w:val="0"/>
+              </w:rPr>
+              <w:t xml:space="preserve">Nos apasiona la construcción de plataformas SaaS (Software as a Service) empresariales, seguras y de alto rendimiento que automaticen flujos operativos complejos y resuelvan problemáticas concretas del sector productivo.</w:t>
+            </w:r>
+          </w:p>
+          <w:p>
+            <w:pPr>
+              <w:spacing w:after="240" w:line="276" w:lineRule="auto"/>
+              <w:jc w:val="both"/>
+              <w:rPr>
+                <w:b w:val="1"/>
+                <w:bCs w:val="1"/>
+              </w:rPr>
+            </w:pPr>
+            <w:r>
+              <w:rPr>
+                <w:b w:val="1"/>
+                <w:bCs w:val="1"/>
+                <w:rtl w:val="0"/>
+              </w:rPr>
+              <w:t xml:space="preserve">Aspectos de los Intereses Reflejados en LifeBetter AIoT</w:t>
+            </w:r>
+          </w:p>
+          <w:p>
+            <w:pPr>
+              <w:numPr>
+                <w:ilvl w:val="0"/>
+                <w:numId w:val="12"/>
+              </w:numPr>
+              <w:spacing w:after="0" w:afterAutospacing="0" w:line="276" w:lineRule="auto"/>
+              <w:ind w:left="720" w:hanging="360"/>
+            </w:pPr>
+            <w:r>
+              <w:rPr>
+                <w:b w:val="1"/>
+                <w:bCs w:val="1"/>
+                <w:rtl w:val="0"/>
+              </w:rPr>
+              <w:t xml:space="preserve">Arquitectura Distribuida y Modelo SaaS:</w:t>
+            </w:r>
+            <w:r>
+              <w:rPr>
+                <w:rtl w:val="0"/>
+              </w:rPr>
+              <w:t xml:space="preserve"> Diseñamos un ecosistema desacoplado basado en un backend centralizado (Python con Django REST Framework) y bases de datos relacionales en PostgreSQL bajo un esquema Multi-Tenant con Row Level Security (RLS) para garantizar aislamiento e integridad de datos.</w:t>
+            </w:r>
+          </w:p>
+          <w:p>
+            <w:pPr>
+              <w:numPr>
+                <w:ilvl w:val="0"/>
+                <w:numId w:val="12"/>
+              </w:numPr>
+              <w:spacing w:after="0" w:afterAutospacing="0" w:line="276" w:lineRule="auto"/>
+              <w:ind w:left="720" w:hanging="360"/>
+            </w:pPr>
+            <w:r>
+              <w:rPr>
+                <w:b w:val="1"/>
+                <w:bCs w:val="1"/>
+                <w:rtl w:val="0"/>
+              </w:rPr>
+              <w:t xml:space="preserve">Desarrollo Móvil e Integración AIoT:</w:t>
+            </w:r>
+            <w:r>
+              <w:rPr>
+                <w:rtl w:val="0"/>
+              </w:rPr>
+              <w:t xml:space="preserve"> Conectamos el backend con aplicaciones móviles dedicadas para la autogestión y validación de accesos mediante códigos QR, complementado con hardware en el borde (</w:t>
+            </w:r>
+            <w:r>
+              <w:rPr>
                 <w:i w:val="1"/>
                 <w:iCs w:val="1"/>
-                <w:color w:val="548dd4"/>
-                <w:sz w:val="20"/>
-                <w:szCs w:val="20"/>
-              </w:rPr>
-            </w:pPr>
-            <w:r>
-              <w:rPr>
-                <w:rFonts w:ascii="Calibri" w:cs="Calibri" w:eastAsia="Calibri" w:hAnsi="Calibri"/>
+                <w:rtl w:val="0"/>
+              </w:rPr>
+              <w:t xml:space="preserve">Edge Computing</w:t>
+            </w:r>
+            <w:r>
+              <w:rPr>
+                <w:rtl w:val="0"/>
+              </w:rPr>
+              <w:t xml:space="preserve">) para la captura y lectura de patentes vehiculares por visión computacional.</w:t>
+            </w:r>
+          </w:p>
+          <w:p>
+            <w:pPr>
+              <w:numPr>
+                <w:ilvl w:val="0"/>
+                <w:numId w:val="12"/>
+              </w:numPr>
+              <w:spacing w:after="240" w:line="276" w:lineRule="auto"/>
+              <w:ind w:left="720" w:hanging="360"/>
+            </w:pPr>
+            <w:r>
+              <w:rPr>
+                <w:b w:val="1"/>
+                <w:bCs w:val="1"/>
+                <w:rtl w:val="0"/>
+              </w:rPr>
+              <w:t xml:space="preserve">Ciberseguridad y Tecnologías Emergentes:</w:t>
+            </w:r>
+            <w:r>
+              <w:rPr>
+                <w:rtl w:val="0"/>
+              </w:rPr>
+              <w:t xml:space="preserve"> Aplicamos las directrices de seguridad OWASP Top 10, transacciones atómicas con pasarelas de pago (Transbank Webpay Plus SDK) y una capa de IA Generativa con arquitectura RAG para responder consultas normativas a partir de los reglamentos de copropiedad.</w:t>
+            </w:r>
+          </w:p>
+          <w:p>
+            <w:pPr>
+              <w:spacing w:after="240" w:line="276" w:lineRule="auto"/>
+              <w:jc w:val="both"/>
+              <w:rPr>
+                <w:b w:val="1"/>
+                <w:bCs w:val="1"/>
+              </w:rPr>
+            </w:pPr>
+            <w:r>
+              <w:rPr>
+                <w:b w:val="1"/>
+                <w:bCs w:val="1"/>
+                <w:rtl w:val="0"/>
+              </w:rPr>
+              <w:t xml:space="preserve">Contribución al Desarrollo Profesional</w:t>
+            </w:r>
+          </w:p>
+          <w:p>
+            <w:pPr>
+              <w:numPr>
+                <w:ilvl w:val="0"/>
+                <w:numId w:val="9"/>
+              </w:numPr>
+              <w:spacing w:after="0" w:afterAutospacing="0" w:line="276" w:lineRule="auto"/>
+              <w:ind w:left="720" w:hanging="360"/>
+            </w:pPr>
+            <w:r>
+              <w:rPr>
+                <w:b w:val="1"/>
+                <w:bCs w:val="1"/>
+                <w:rtl w:val="0"/>
+              </w:rPr>
+              <w:t xml:space="preserve">Validación Práctica del Ciclo de Vida del Software (SDLC):</w:t>
+            </w:r>
+            <w:r>
+              <w:rPr>
+                <w:rtl w:val="0"/>
+              </w:rPr>
+              <w:t xml:space="preserve"> Ejecutar este proyecto de principio a fin nos permite aplicar estándares de la industria, incluyendo control de versiones colaborativo con Git, automatización de pruebas unitarias/integración con Pytest, pipelines de CI/CD y contenerización con Docker.</w:t>
+            </w:r>
+          </w:p>
+          <w:p>
+            <w:pPr>
+              <w:numPr>
+                <w:ilvl w:val="0"/>
+                <w:numId w:val="9"/>
+              </w:numPr>
+              <w:spacing w:after="0" w:afterAutospacing="0" w:line="276" w:lineRule="auto"/>
+              <w:ind w:left="720" w:hanging="360"/>
+            </w:pPr>
+            <w:r>
+              <w:rPr>
+                <w:b w:val="1"/>
+                <w:bCs w:val="1"/>
+                <w:rtl w:val="0"/>
+              </w:rPr>
+              <w:t xml:space="preserve">Gestión y Trabajo Colaborativo:</w:t>
+            </w:r>
+            <w:r>
+              <w:rPr>
+                <w:rtl w:val="0"/>
+              </w:rPr>
+              <w:t xml:space="preserve"> Al abordar el proyecto en un equipo de dos personas, fortalecemos habilidades de coordinación técnica y metodologías ágiles (Scrum), distribuyendo de forma estructurada los frentes de arquitectura, documentación técnica, desarrollo Full-Stack y aseguramiento de calidad (QA).</w:t>
+            </w:r>
+          </w:p>
+          <w:p>
+            <w:pPr>
+              <w:numPr>
+                <w:ilvl w:val="0"/>
+                <w:numId w:val="9"/>
+              </w:numPr>
+              <w:spacing w:after="240" w:line="276" w:lineRule="auto"/>
+              <w:ind w:left="720" w:hanging="360"/>
+            </w:pPr>
+            <w:r>
+              <w:rPr>
+                <w:b w:val="1"/>
+                <w:bCs w:val="1"/>
+                <w:rtl w:val="0"/>
+              </w:rPr>
+              <w:t xml:space="preserve">Proyección Laboral en la Industria TI:</w:t>
+            </w:r>
+            <w:r>
+              <w:rPr>
+                <w:rtl w:val="0"/>
+              </w:rPr>
+              <w:t xml:space="preserve"> Construir una solución de nivel empresarial nos prepara para asumir roles de liderazgo técnico, desarrolladores Full-Stack y arquitectos de software en la creciente industria </w:t>
+            </w:r>
+            <w:r>
+              <w:rPr>
                 <w:i w:val="1"/>
                 <w:iCs w:val="1"/>
-                <w:color w:val="548dd4"/>
-                <w:sz w:val="20"/>
-                <w:szCs w:val="20"/>
-                <w:rtl w:val="0"/>
-              </w:rPr>
-              <w:t xml:space="preserve">Señala cómo se relaciona el Proyecto APT que propones con tus intereses profesionales.</w:t>
-            </w:r>
-          </w:p>
-          <w:p>
-            <w:pPr>
-              <w:jc w:val="both"/>
-              <w:rPr>
-                <w:rFonts w:ascii="Calibri" w:cs="Calibri" w:eastAsia="Calibri" w:hAnsi="Calibri"/>
-                <w:i w:val="1"/>
-                <w:iCs w:val="1"/>
-                <w:color w:val="548dd4"/>
-                <w:sz w:val="20"/>
-                <w:szCs w:val="20"/>
-                <w:highlight w:val="yellow"/>
-              </w:rPr>
-            </w:pPr>
-            <w:r>
-              <w:rPr>
-                <w:rFonts w:ascii="Calibri" w:cs="Calibri" w:eastAsia="Calibri" w:hAnsi="Calibri"/>
-                <w:i w:val="1"/>
-                <w:iCs w:val="1"/>
-                <w:color w:val="548dd4"/>
-                <w:sz w:val="20"/>
-                <w:szCs w:val="20"/>
-                <w:rtl w:val="0"/>
-              </w:rPr>
-              <w:t xml:space="preserve">¿Cuáles son tus intereses profesionales?  ¿Qué aspectos de tus intereses profesionales se ven reflejados en tu Proyecto APT? Realizar este Proyecto APT, ¿de qué manera va a contribuir a tu desarrollo profesional? </w:t>
+                <w:rtl w:val="0"/>
+              </w:rPr>
+              <w:t xml:space="preserve">Protech</w:t>
+            </w:r>
+            <w:r>
+              <w:rPr>
+                <w:rtl w:val="0"/>
+              </w:rPr>
+              <w:t xml:space="preserve"> y en empresas de desarrollo tecnológico</w:t>
+            </w:r>
+            <w:r>
+              <w:rPr>
+                <w:rFonts w:ascii="Calibri" w:cs="Calibri" w:eastAsia="Calibri" w:hAnsi="Calibri"/>
+                <w:rtl w:val="0"/>
+              </w:rPr>
+              <w:t xml:space="preserve"> </w:t>
             </w:r>
             <w:r>
               <w:rPr>
@@ -1894,336 +2568,315 @@
           </w:tcPr>
           <w:p>
             <w:pPr>
-              <w:jc w:val="both"/>
-              <w:rPr>
-                <w:rFonts w:ascii="Calibri" w:cs="Calibri" w:eastAsia="Calibri" w:hAnsi="Calibri"/>
-                <w:i w:val="1"/>
-                <w:iCs w:val="1"/>
-                <w:color w:val="548dd4"/>
-                <w:sz w:val="20"/>
-                <w:szCs w:val="20"/>
-              </w:rPr>
-            </w:pPr>
-            <w:r>
-              <w:rPr>
-                <w:rFonts w:ascii="Calibri" w:cs="Calibri" w:eastAsia="Calibri" w:hAnsi="Calibri"/>
-                <w:i w:val="1"/>
-                <w:iCs w:val="1"/>
-                <w:color w:val="548dd4"/>
-                <w:sz w:val="20"/>
-                <w:szCs w:val="20"/>
-                <w:rtl w:val="0"/>
-              </w:rPr>
-              <w:t xml:space="preserve">Justifica brevemente por qué es posible desarrollar tu proyecto APT. Considera el tiempo y materiales que necesitas para desarrollarlo, así como los posibles factores externos que podrían dificultar y facilitar su desarrollo.  </w:t>
-            </w:r>
-          </w:p>
-          <w:p>
-            <w:pPr>
-              <w:rPr>
-                <w:rFonts w:ascii="Calibri" w:cs="Calibri" w:eastAsia="Calibri" w:hAnsi="Calibri"/>
-                <w:i w:val="1"/>
-                <w:iCs w:val="1"/>
-                <w:color w:val="548dd4"/>
-                <w:sz w:val="20"/>
-                <w:szCs w:val="20"/>
-              </w:rPr>
-            </w:pPr>
-            <w:r>
-              <w:rPr>
-                <w:rFonts w:ascii="Calibri" w:cs="Calibri" w:eastAsia="Calibri" w:hAnsi="Calibri"/>
-                <w:i w:val="1"/>
-                <w:iCs w:val="1"/>
-                <w:color w:val="548dd4"/>
-                <w:sz w:val="20"/>
-                <w:szCs w:val="20"/>
-                <w:rtl w:val="0"/>
-              </w:rPr>
-              <w:t xml:space="preserve">¿Por qué crees es posible desarrollar tu Proyecto APT? Para responder esta pregunta debes tener en consideración:</w:t>
-            </w:r>
-          </w:p>
-          <w:p>
-            <w:pPr>
-              <w:keepNext w:val="0"/>
-              <w:keepLines w:val="0"/>
-              <w:pageBreakBefore w:val="0"/>
-              <w:widowControl w:val="1"/>
+              <w:spacing w:after="240" w:line="276" w:lineRule="auto"/>
+              <w:rPr>
+                <w:b w:val="1"/>
+                <w:bCs w:val="1"/>
+              </w:rPr>
+            </w:pPr>
+            <w:r>
+              <w:rPr>
+                <w:b w:val="1"/>
+                <w:bCs w:val="1"/>
+                <w:rtl w:val="0"/>
+              </w:rPr>
+              <w:t xml:space="preserve">Factibilidad de Tiempo y Planificación Académica</w:t>
+            </w:r>
+          </w:p>
+          <w:p>
+            <w:pPr>
+              <w:numPr>
+                <w:ilvl w:val="0"/>
+                <w:numId w:val="14"/>
+              </w:numPr>
+              <w:spacing w:after="0" w:afterAutospacing="0" w:line="276" w:lineRule="auto"/>
+              <w:ind w:left="720" w:hanging="360"/>
+            </w:pPr>
+            <w:r>
+              <w:rPr>
+                <w:b w:val="1"/>
+                <w:bCs w:val="1"/>
+                <w:rtl w:val="0"/>
+              </w:rPr>
+              <w:t xml:space="preserve">Duración del Semestre y Horas Asignadas:</w:t>
+            </w:r>
+            <w:r>
+              <w:rPr>
+                <w:rtl w:val="0"/>
+              </w:rPr>
+              <w:t xml:space="preserve"> El desarrollo del proyecto es completamente viable dentro del marco del semestre académico estipulado de 20 semanas (5 meses). Se contemplan las horas lectivas asignadas a la asignatura de Capstone complementadas con una carga estructurada de trabajo autónomo semanal por integrante.</w:t>
+            </w:r>
+          </w:p>
+          <w:p>
+            <w:pPr>
+              <w:numPr>
+                <w:ilvl w:val="0"/>
+                <w:numId w:val="14"/>
+              </w:numPr>
+              <w:spacing w:after="240" w:line="276" w:lineRule="auto"/>
+              <w:ind w:left="720" w:hanging="360"/>
+            </w:pPr>
+            <w:r>
+              <w:rPr>
+                <w:b w:val="1"/>
+                <w:bCs w:val="1"/>
+                <w:rtl w:val="0"/>
+              </w:rPr>
+              <w:t xml:space="preserve">Estrategia de Trabajo en Pareja:</w:t>
+            </w:r>
+            <w:r>
+              <w:rPr>
+                <w:rtl w:val="0"/>
+              </w:rPr>
+              <w:t xml:space="preserve"> Para optimizar los tiempos, el equipo de dos integrantes divide sus responsabilidades de forma paralela: un integrante lidera la arquitectura de software, especificaciones técnicas, diseño de pruebas (QA) y documentación de ingeniería, mientras que el otro se enfoca en el desarrollo Full-Stack (Backend/DRF, Frontend, App Móvil), DevOps y la integración AIoT. Se utiliza el marco ágil Scrum con sprints de entregas incrementales para validar hitos semana a semana.</w:t>
+            </w:r>
+          </w:p>
+          <w:p>
+            <w:pPr>
+              <w:spacing w:after="240" w:line="276" w:lineRule="auto"/>
+              <w:rPr>
+                <w:b w:val="1"/>
+                <w:bCs w:val="1"/>
+              </w:rPr>
+            </w:pPr>
+            <w:r>
+              <w:rPr>
+                <w:b w:val="1"/>
+                <w:bCs w:val="1"/>
+                <w:rtl w:val="0"/>
+              </w:rPr>
+              <w:t xml:space="preserve">Materiales y Recursos Requeridos</w:t>
+            </w:r>
+          </w:p>
+          <w:p>
+            <w:pPr>
               <w:numPr>
                 <w:ilvl w:val="0"/>
                 <w:numId w:val="2"/>
               </w:numPr>
-              <w:pBdr>
-                <w:top w:space="0" w:sz="0" w:val="nil"/>
-                <w:left w:space="0" w:sz="0" w:val="nil"/>
-                <w:bottom w:space="0" w:sz="0" w:val="nil"/>
-                <w:right w:space="0" w:sz="0" w:val="nil"/>
-                <w:between w:space="0" w:sz="0" w:val="nil"/>
-              </w:pBdr>
-              <w:shd w:fill="auto" w:val="clear"/>
-              <w:spacing w:after="0" w:before="0" w:line="259" w:lineRule="auto"/>
-              <w:ind w:left="720" w:right="0" w:hanging="360"/>
-              <w:jc w:val="left"/>
-              <w:rPr>
-                <w:rFonts w:ascii="Calibri" w:cs="Calibri" w:eastAsia="Calibri" w:hAnsi="Calibri"/>
-                <w:b w:val="0"/>
-                <w:bCs w:val="0"/>
-                <w:i w:val="1"/>
-                <w:iCs w:val="1"/>
-                <w:smallCaps w:val="0"/>
-                <w:strike w:val="0"/>
-                <w:color w:val="548dd4"/>
-                <w:sz w:val="20"/>
-                <w:szCs w:val="20"/>
-                <w:u w:val="none"/>
-                <w:shd w:fill="auto" w:val="clear"/>
-                <w:vertAlign w:val="baseline"/>
-              </w:rPr>
-            </w:pPr>
-            <w:r>
-              <w:rPr>
-                <w:rFonts w:ascii="Calibri" w:cs="Calibri" w:eastAsia="Calibri" w:hAnsi="Calibri"/>
-                <w:b w:val="0"/>
-                <w:bCs w:val="0"/>
-                <w:i w:val="1"/>
-                <w:iCs w:val="1"/>
-                <w:smallCaps w:val="0"/>
-                <w:strike w:val="0"/>
-                <w:color w:val="548dd4"/>
-                <w:sz w:val="20"/>
-                <w:szCs w:val="20"/>
-                <w:u w:val="none"/>
-                <w:shd w:fill="auto" w:val="clear"/>
-                <w:vertAlign w:val="baseline"/>
-                <w:rtl w:val="0"/>
-              </w:rPr>
-              <w:t xml:space="preserve">Duración del semestre</w:t>
-            </w:r>
-          </w:p>
-          <w:p>
-            <w:pPr>
-              <w:keepNext w:val="0"/>
-              <w:keepLines w:val="0"/>
-              <w:pageBreakBefore w:val="0"/>
-              <w:widowControl w:val="1"/>
+              <w:spacing w:after="0" w:afterAutospacing="0" w:line="276" w:lineRule="auto"/>
+              <w:ind w:left="720" w:hanging="360"/>
+            </w:pPr>
+            <w:r>
+              <w:rPr>
+                <w:b w:val="1"/>
+                <w:bCs w:val="1"/>
+                <w:rtl w:val="0"/>
+              </w:rPr>
+              <w:t xml:space="preserve">Stack Tecnológico Open-Source:</w:t>
+            </w:r>
+            <w:r>
+              <w:rPr>
+                <w:rtl w:val="0"/>
+              </w:rPr>
+              <w:t xml:space="preserve"> No se requiere inversión en licencias de software privativo. Todo el ecosistema está basado en tecnologías de código abierto maduras y gratuitas: Python, Django REST Framework, PostgreSQL, Docker y la suite de testing Pytest.</w:t>
+            </w:r>
+          </w:p>
+          <w:p>
+            <w:pPr>
               <w:numPr>
                 <w:ilvl w:val="0"/>
                 <w:numId w:val="2"/>
               </w:numPr>
-              <w:pBdr>
-                <w:top w:space="0" w:sz="0" w:val="nil"/>
-                <w:left w:space="0" w:sz="0" w:val="nil"/>
-                <w:bottom w:space="0" w:sz="0" w:val="nil"/>
-                <w:right w:space="0" w:sz="0" w:val="nil"/>
-                <w:between w:space="0" w:sz="0" w:val="nil"/>
-              </w:pBdr>
-              <w:shd w:fill="auto" w:val="clear"/>
-              <w:spacing w:after="0" w:before="0" w:line="259" w:lineRule="auto"/>
-              <w:ind w:left="720" w:right="0" w:hanging="360"/>
-              <w:jc w:val="left"/>
-              <w:rPr>
-                <w:rFonts w:ascii="Calibri" w:cs="Calibri" w:eastAsia="Calibri" w:hAnsi="Calibri"/>
-                <w:b w:val="0"/>
-                <w:bCs w:val="0"/>
-                <w:i w:val="1"/>
-                <w:iCs w:val="1"/>
-                <w:smallCaps w:val="0"/>
-                <w:strike w:val="0"/>
-                <w:color w:val="548dd4"/>
-                <w:sz w:val="20"/>
-                <w:szCs w:val="20"/>
-                <w:u w:val="none"/>
-                <w:shd w:fill="auto" w:val="clear"/>
-                <w:vertAlign w:val="baseline"/>
-              </w:rPr>
-            </w:pPr>
-            <w:r>
-              <w:rPr>
-                <w:rFonts w:ascii="Calibri" w:cs="Calibri" w:eastAsia="Calibri" w:hAnsi="Calibri"/>
-                <w:b w:val="0"/>
-                <w:bCs w:val="0"/>
-                <w:i w:val="1"/>
-                <w:iCs w:val="1"/>
-                <w:smallCaps w:val="0"/>
-                <w:strike w:val="0"/>
-                <w:color w:val="548dd4"/>
-                <w:sz w:val="20"/>
-                <w:szCs w:val="20"/>
-                <w:u w:val="none"/>
-                <w:shd w:fill="auto" w:val="clear"/>
-                <w:vertAlign w:val="baseline"/>
-                <w:rtl w:val="0"/>
-              </w:rPr>
-              <w:t xml:space="preserve">Horas asignadas a la asignatura </w:t>
-            </w:r>
-          </w:p>
-          <w:p>
-            <w:pPr>
-              <w:keepNext w:val="0"/>
-              <w:keepLines w:val="0"/>
-              <w:pageBreakBefore w:val="0"/>
-              <w:widowControl w:val="1"/>
+              <w:spacing w:after="0" w:afterAutospacing="0" w:line="276" w:lineRule="auto"/>
+              <w:ind w:left="720" w:hanging="360"/>
+            </w:pPr>
+            <w:r>
+              <w:rPr>
+                <w:b w:val="1"/>
+                <w:bCs w:val="1"/>
+                <w:rtl w:val="0"/>
+              </w:rPr>
+              <w:t xml:space="preserve">Infraestructura y Hardware:</w:t>
+            </w:r>
+            <w:r>
+              <w:rPr>
+                <w:rtl w:val="0"/>
+              </w:rPr>
+              <w:t xml:space="preserve"> El desarrollo se ejecuta en equipos de cómputo personales utilizando contenedores locales para emular el entorno de producción. Para el control de accesos se emplean dispositivos móviles estándar para las pruebas de generación/escaneo de códigos QR y cámaras web convencionales para la captura y validación de las rutinas de visión computacional (AIoT).</w:t>
+            </w:r>
+          </w:p>
+          <w:p>
+            <w:pPr>
               <w:numPr>
                 <w:ilvl w:val="0"/>
                 <w:numId w:val="2"/>
               </w:numPr>
-              <w:pBdr>
-                <w:top w:space="0" w:sz="0" w:val="nil"/>
-                <w:left w:space="0" w:sz="0" w:val="nil"/>
-                <w:bottom w:space="0" w:sz="0" w:val="nil"/>
-                <w:right w:space="0" w:sz="0" w:val="nil"/>
-                <w:between w:space="0" w:sz="0" w:val="nil"/>
-              </w:pBdr>
-              <w:shd w:fill="auto" w:val="clear"/>
-              <w:spacing w:after="0" w:before="0" w:line="259" w:lineRule="auto"/>
-              <w:ind w:left="720" w:right="0" w:hanging="360"/>
-              <w:jc w:val="left"/>
-              <w:rPr>
-                <w:rFonts w:ascii="Calibri" w:cs="Calibri" w:eastAsia="Calibri" w:hAnsi="Calibri"/>
-                <w:b w:val="0"/>
-                <w:bCs w:val="0"/>
-                <w:i w:val="1"/>
-                <w:iCs w:val="1"/>
-                <w:smallCaps w:val="0"/>
-                <w:strike w:val="0"/>
-                <w:color w:val="548dd4"/>
-                <w:sz w:val="20"/>
-                <w:szCs w:val="20"/>
-                <w:u w:val="none"/>
-                <w:shd w:fill="auto" w:val="clear"/>
-                <w:vertAlign w:val="baseline"/>
-              </w:rPr>
-            </w:pPr>
-            <w:r>
-              <w:rPr>
-                <w:rFonts w:ascii="Calibri" w:cs="Calibri" w:eastAsia="Calibri" w:hAnsi="Calibri"/>
-                <w:b w:val="0"/>
-                <w:bCs w:val="0"/>
-                <w:i w:val="1"/>
-                <w:iCs w:val="1"/>
-                <w:smallCaps w:val="0"/>
-                <w:strike w:val="0"/>
-                <w:color w:val="548dd4"/>
-                <w:sz w:val="20"/>
-                <w:szCs w:val="20"/>
-                <w:u w:val="none"/>
-                <w:shd w:fill="auto" w:val="clear"/>
-                <w:vertAlign w:val="baseline"/>
-                <w:rtl w:val="0"/>
-              </w:rPr>
-              <w:t xml:space="preserve">Materiales requeridos</w:t>
-            </w:r>
-          </w:p>
-          <w:p>
-            <w:pPr>
-              <w:keepNext w:val="0"/>
-              <w:keepLines w:val="0"/>
-              <w:pageBreakBefore w:val="0"/>
-              <w:widowControl w:val="1"/>
+              <w:spacing w:after="240" w:line="276" w:lineRule="auto"/>
+              <w:ind w:left="720" w:hanging="360"/>
+            </w:pPr>
+            <w:r>
+              <w:rPr>
+                <w:b w:val="1"/>
+                <w:bCs w:val="1"/>
+                <w:rtl w:val="0"/>
+              </w:rPr>
+              <w:t xml:space="preserve">Servicios Cloud y CI/CD:</w:t>
+            </w:r>
+            <w:r>
+              <w:rPr>
+                <w:rtl w:val="0"/>
+              </w:rPr>
+              <w:t xml:space="preserve"> Se aprovechan los tiers gratuitos para desarrollo y testing de plataformas como GitHub (control de versiones y pipelines de CI/CD con GitHub Actions) y entornos de base de datos locales o gestionados sin costo.</w:t>
+            </w:r>
+          </w:p>
+          <w:p>
+            <w:pPr>
+              <w:spacing w:after="240" w:line="276" w:lineRule="auto"/>
+              <w:rPr>
+                <w:b w:val="1"/>
+                <w:bCs w:val="1"/>
+              </w:rPr>
+            </w:pPr>
+            <w:r>
+              <w:rPr>
+                <w:b w:val="1"/>
+                <w:bCs w:val="1"/>
+                <w:rtl w:val="0"/>
+              </w:rPr>
+              <w:t xml:space="preserve">Factores Externos Facilitadores</w:t>
+            </w:r>
+          </w:p>
+          <w:p>
+            <w:pPr>
               <w:numPr>
                 <w:ilvl w:val="0"/>
-                <w:numId w:val="2"/>
+                <w:numId w:val="6"/>
               </w:numPr>
-              <w:pBdr>
-                <w:top w:space="0" w:sz="0" w:val="nil"/>
-                <w:left w:space="0" w:sz="0" w:val="nil"/>
-                <w:bottom w:space="0" w:sz="0" w:val="nil"/>
-                <w:right w:space="0" w:sz="0" w:val="nil"/>
-                <w:between w:space="0" w:sz="0" w:val="nil"/>
-              </w:pBdr>
-              <w:shd w:fill="auto" w:val="clear"/>
-              <w:spacing w:after="0" w:before="0" w:line="259" w:lineRule="auto"/>
-              <w:ind w:left="720" w:right="0" w:hanging="360"/>
-              <w:jc w:val="left"/>
-              <w:rPr>
-                <w:rFonts w:ascii="Calibri" w:cs="Calibri" w:eastAsia="Calibri" w:hAnsi="Calibri"/>
-                <w:b w:val="0"/>
-                <w:bCs w:val="0"/>
-                <w:i w:val="1"/>
-                <w:iCs w:val="1"/>
-                <w:smallCaps w:val="0"/>
-                <w:strike w:val="0"/>
-                <w:color w:val="548dd4"/>
-                <w:sz w:val="20"/>
-                <w:szCs w:val="20"/>
-                <w:u w:val="none"/>
-                <w:shd w:fill="auto" w:val="clear"/>
-                <w:vertAlign w:val="baseline"/>
-              </w:rPr>
-            </w:pPr>
-            <w:r>
-              <w:rPr>
-                <w:rFonts w:ascii="Calibri" w:cs="Calibri" w:eastAsia="Calibri" w:hAnsi="Calibri"/>
-                <w:b w:val="0"/>
-                <w:bCs w:val="0"/>
-                <w:i w:val="1"/>
-                <w:iCs w:val="1"/>
-                <w:smallCaps w:val="0"/>
-                <w:strike w:val="0"/>
-                <w:color w:val="548dd4"/>
-                <w:sz w:val="20"/>
-                <w:szCs w:val="20"/>
-                <w:u w:val="none"/>
-                <w:shd w:fill="auto" w:val="clear"/>
-                <w:vertAlign w:val="baseline"/>
-                <w:rtl w:val="0"/>
-              </w:rPr>
-              <w:t xml:space="preserve">Factores externos que facilitan su desarrollo </w:t>
-            </w:r>
-          </w:p>
-          <w:p>
-            <w:pPr>
-              <w:keepNext w:val="0"/>
-              <w:keepLines w:val="0"/>
-              <w:pageBreakBefore w:val="0"/>
-              <w:widowControl w:val="1"/>
+              <w:spacing w:after="0" w:afterAutospacing="0" w:line="276" w:lineRule="auto"/>
+              <w:ind w:left="720" w:hanging="360"/>
+            </w:pPr>
+            <w:r>
+              <w:rPr>
+                <w:b w:val="1"/>
+                <w:bCs w:val="1"/>
+                <w:rtl w:val="0"/>
+              </w:rPr>
+              <w:t xml:space="preserve">Entornos de Pruebas y Sandboxes Abiertos:</w:t>
+            </w:r>
+            <w:r>
+              <w:rPr>
+                <w:rtl w:val="0"/>
+              </w:rPr>
+              <w:t xml:space="preserve"> Transbank provee SDKs oficiales y entornos de prueba (Integration Testing) totalmente funcionales con credenciales de certificación pública, lo que permite implementar y testear el flujo de pagos sin contratos comerciales previos.</w:t>
+            </w:r>
+          </w:p>
+          <w:p>
+            <w:pPr>
               <w:numPr>
                 <w:ilvl w:val="0"/>
-                <w:numId w:val="2"/>
+                <w:numId w:val="6"/>
               </w:numPr>
-              <w:pBdr>
-                <w:top w:space="0" w:sz="0" w:val="nil"/>
-                <w:left w:space="0" w:sz="0" w:val="nil"/>
-                <w:bottom w:space="0" w:sz="0" w:val="nil"/>
-                <w:right w:space="0" w:sz="0" w:val="nil"/>
-                <w:between w:space="0" w:sz="0" w:val="nil"/>
-              </w:pBdr>
-              <w:shd w:fill="auto" w:val="clear"/>
-              <w:spacing w:after="160" w:before="0" w:line="259" w:lineRule="auto"/>
-              <w:ind w:left="720" w:right="0" w:hanging="360"/>
-              <w:jc w:val="left"/>
-              <w:rPr>
-                <w:rFonts w:ascii="Calibri" w:cs="Calibri" w:eastAsia="Calibri" w:hAnsi="Calibri"/>
-                <w:b w:val="0"/>
-                <w:bCs w:val="0"/>
-                <w:i w:val="1"/>
-                <w:iCs w:val="1"/>
-                <w:smallCaps w:val="0"/>
-                <w:strike w:val="0"/>
-                <w:color w:val="548dd4"/>
-                <w:sz w:val="20"/>
-                <w:szCs w:val="20"/>
-                <w:u w:val="none"/>
-                <w:shd w:fill="auto" w:val="clear"/>
-                <w:vertAlign w:val="baseline"/>
-              </w:rPr>
-            </w:pPr>
-            <w:r>
-              <w:rPr>
-                <w:rFonts w:ascii="Calibri" w:cs="Calibri" w:eastAsia="Calibri" w:hAnsi="Calibri"/>
-                <w:b w:val="0"/>
-                <w:bCs w:val="0"/>
-                <w:i w:val="1"/>
-                <w:iCs w:val="1"/>
-                <w:smallCaps w:val="0"/>
-                <w:strike w:val="0"/>
-                <w:color w:val="548dd4"/>
-                <w:sz w:val="20"/>
-                <w:szCs w:val="20"/>
-                <w:u w:val="none"/>
-                <w:shd w:fill="auto" w:val="clear"/>
-                <w:vertAlign w:val="baseline"/>
-                <w:rtl w:val="0"/>
-              </w:rPr>
-              <w:t xml:space="preserve">Factores externos que dificultan su desarrollo y maneras en que podrías solucionarlos</w:t>
+              <w:spacing w:after="240" w:line="276" w:lineRule="auto"/>
+              <w:ind w:left="720" w:hanging="360"/>
+            </w:pPr>
+            <w:r>
+              <w:rPr>
+                <w:b w:val="1"/>
+                <w:bCs w:val="1"/>
+                <w:rtl w:val="0"/>
+              </w:rPr>
+              <w:t xml:space="preserve">Ecosistema y Documentación Robusta:</w:t>
+            </w:r>
+            <w:r>
+              <w:rPr>
+                <w:rtl w:val="0"/>
+              </w:rPr>
+              <w:t xml:space="preserve"> La alta madurez técnica y documentación oficial de Django, PostgreSQL, librerías de visión por computador y modelos LLM reduce la curva de aprendizaje y acelera la resolución de problemas técnicos.</w:t>
+            </w:r>
+          </w:p>
+          <w:p>
+            <w:pPr>
+              <w:spacing w:after="240" w:line="276" w:lineRule="auto"/>
+              <w:rPr>
+                <w:b w:val="1"/>
+                <w:bCs w:val="1"/>
+              </w:rPr>
+            </w:pPr>
+            <w:r>
+              <w:rPr>
+                <w:b w:val="1"/>
+                <w:bCs w:val="1"/>
+                <w:rtl w:val="0"/>
+              </w:rPr>
+              <w:t xml:space="preserve">Factores Externos Dificultades y Estrategias de Mitigación</w:t>
+            </w:r>
+          </w:p>
+          <w:p>
+            <w:pPr>
+              <w:numPr>
+                <w:ilvl w:val="0"/>
+                <w:numId w:val="1"/>
+              </w:numPr>
+              <w:spacing w:after="0" w:afterAutospacing="0" w:line="276" w:lineRule="auto"/>
+              <w:ind w:left="720" w:hanging="360"/>
+            </w:pPr>
+            <w:r>
+              <w:rPr>
+                <w:b w:val="1"/>
+                <w:bCs w:val="1"/>
+                <w:rtl w:val="0"/>
+              </w:rPr>
+              <w:t xml:space="preserve">Latencia o Fallas en Servicios de Terceros:</w:t>
+            </w:r>
+            <w:r>
+              <w:rPr>
+                <w:rtl w:val="0"/>
+              </w:rPr>
+              <w:t xml:space="preserve"> Posibles caídas o retrasos en respuestas de pasarelas bancarias o APIs externas se mitigan mediante el diseño de pruebas unitarias con stubs/mocks en Pytest y el manejo de transacciones atómicas seguras en la base de datos.</w:t>
+            </w:r>
+          </w:p>
+          <w:p>
+            <w:pPr>
+              <w:numPr>
+                <w:ilvl w:val="0"/>
+                <w:numId w:val="1"/>
+              </w:numPr>
+              <w:spacing w:after="0" w:afterAutospacing="0" w:line="276" w:lineRule="auto"/>
+              <w:ind w:left="720" w:hanging="360"/>
+            </w:pPr>
+            <w:r>
+              <w:rPr>
+                <w:b w:val="1"/>
+                <w:bCs w:val="1"/>
+                <w:rtl w:val="0"/>
+              </w:rPr>
+              <w:t xml:space="preserve">Dependencia de Hardware Físico en AIoT:</w:t>
+            </w:r>
+            <w:r>
+              <w:rPr>
+                <w:rtl w:val="0"/>
+              </w:rPr>
+              <w:t xml:space="preserve"> La variabilidad de iluminación en cámaras o falta de hardware especializado en terreno se soluciona alimentando el pipeline de visión computacional con datasets y streams de video sintéticos grabados localmente para calibrar el reconocimiento de patentes antes de la prueba en vivo.</w:t>
+            </w:r>
+          </w:p>
+          <w:p>
+            <w:pPr>
+              <w:numPr>
+                <w:ilvl w:val="0"/>
+                <w:numId w:val="1"/>
+              </w:numPr>
+              <w:spacing w:after="240" w:line="276" w:lineRule="auto"/>
+              <w:ind w:left="720" w:hanging="360"/>
+            </w:pPr>
+            <w:r>
+              <w:rPr>
+                <w:b w:val="1"/>
+                <w:bCs w:val="1"/>
+                <w:rtl w:val="0"/>
+              </w:rPr>
+              <w:t xml:space="preserve">Riesgo de Desborde de Alcance (Scope Creep):</w:t>
+            </w:r>
+            <w:r>
+              <w:rPr>
+                <w:rtl w:val="0"/>
+              </w:rPr>
+              <w:t xml:space="preserve"> Ante la complejidad de orquestar web, móvil, IA y hardware, se aplica una priorización estricta bajo el método MoSCoW en el Backlog, garantizando primero un MVP transaccional robusto antes de acoplar las características avanzadas.</w:t>
+            </w:r>
+            <w:r>
+              <w:rPr>
+                <w:rtl w:val="0"/>
+              </w:rPr>
             </w:r>
           </w:p>
         </w:tc>
@@ -2253,7 +2906,7 @@
         <w:widowControl w:val="1"/>
         <w:numPr>
           <w:ilvl w:val="0"/>
-          <w:numId w:val="1"/>
+          <w:numId w:val="10"/>
         </w:numPr>
         <w:pBdr>
           <w:top w:space="0" w:sz="0" w:val="nil"/>
@@ -7526,6 +8179,1005 @@
   <w:abstractNum w:abstractNumId="1">
     <w:lvl w:ilvl="0">
       <w:start w:val="1"/>
+      <w:numFmt w:val="bullet"/>
+      <w:lvlText w:val="●"/>
+      <w:lvlJc w:val="left"/>
+      <w:pPr>
+        <w:ind w:left="720" w:hanging="360"/>
+      </w:pPr>
+      <w:rPr>
+        <w:rFonts w:ascii="Arial" w:cs="Arial" w:eastAsia="Arial" w:hAnsi="Arial"/>
+        <w:u w:val="none"/>
+      </w:rPr>
+    </w:lvl>
+    <w:lvl w:ilvl="1">
+      <w:start w:val="1"/>
+      <w:numFmt w:val="bullet"/>
+      <w:lvlText w:val="○"/>
+      <w:lvlJc w:val="left"/>
+      <w:pPr>
+        <w:ind w:left="1440" w:hanging="360"/>
+      </w:pPr>
+      <w:rPr>
+        <w:u w:val="none"/>
+      </w:rPr>
+    </w:lvl>
+    <w:lvl w:ilvl="2">
+      <w:start w:val="1"/>
+      <w:numFmt w:val="bullet"/>
+      <w:lvlText w:val="■"/>
+      <w:lvlJc w:val="left"/>
+      <w:pPr>
+        <w:ind w:left="2160" w:hanging="360"/>
+      </w:pPr>
+      <w:rPr>
+        <w:u w:val="none"/>
+      </w:rPr>
+    </w:lvl>
+    <w:lvl w:ilvl="3">
+      <w:start w:val="1"/>
+      <w:numFmt w:val="bullet"/>
+      <w:lvlText w:val="●"/>
+      <w:lvlJc w:val="left"/>
+      <w:pPr>
+        <w:ind w:left="2880" w:hanging="360"/>
+      </w:pPr>
+      <w:rPr>
+        <w:u w:val="none"/>
+      </w:rPr>
+    </w:lvl>
+    <w:lvl w:ilvl="4">
+      <w:start w:val="1"/>
+      <w:numFmt w:val="bullet"/>
+      <w:lvlText w:val="○"/>
+      <w:lvlJc w:val="left"/>
+      <w:pPr>
+        <w:ind w:left="3600" w:hanging="360"/>
+      </w:pPr>
+      <w:rPr>
+        <w:u w:val="none"/>
+      </w:rPr>
+    </w:lvl>
+    <w:lvl w:ilvl="5">
+      <w:start w:val="1"/>
+      <w:numFmt w:val="bullet"/>
+      <w:lvlText w:val="■"/>
+      <w:lvlJc w:val="left"/>
+      <w:pPr>
+        <w:ind w:left="4320" w:hanging="360"/>
+      </w:pPr>
+      <w:rPr>
+        <w:u w:val="none"/>
+      </w:rPr>
+    </w:lvl>
+    <w:lvl w:ilvl="6">
+      <w:start w:val="1"/>
+      <w:numFmt w:val="bullet"/>
+      <w:lvlText w:val="●"/>
+      <w:lvlJc w:val="left"/>
+      <w:pPr>
+        <w:ind w:left="5040" w:hanging="360"/>
+      </w:pPr>
+      <w:rPr>
+        <w:u w:val="none"/>
+      </w:rPr>
+    </w:lvl>
+    <w:lvl w:ilvl="7">
+      <w:start w:val="1"/>
+      <w:numFmt w:val="bullet"/>
+      <w:lvlText w:val="○"/>
+      <w:lvlJc w:val="left"/>
+      <w:pPr>
+        <w:ind w:left="5760" w:hanging="360"/>
+      </w:pPr>
+      <w:rPr>
+        <w:u w:val="none"/>
+      </w:rPr>
+    </w:lvl>
+    <w:lvl w:ilvl="8">
+      <w:start w:val="1"/>
+      <w:numFmt w:val="bullet"/>
+      <w:lvlText w:val="■"/>
+      <w:lvlJc w:val="left"/>
+      <w:pPr>
+        <w:ind w:left="6480" w:hanging="360"/>
+      </w:pPr>
+      <w:rPr>
+        <w:u w:val="none"/>
+      </w:rPr>
+    </w:lvl>
+  </w:abstractNum>
+  <w:abstractNum w:abstractNumId="2">
+    <w:lvl w:ilvl="0">
+      <w:start w:val="1"/>
+      <w:numFmt w:val="bullet"/>
+      <w:lvlText w:val="●"/>
+      <w:lvlJc w:val="left"/>
+      <w:pPr>
+        <w:ind w:left="720" w:hanging="360"/>
+      </w:pPr>
+      <w:rPr>
+        <w:rFonts w:ascii="Arial" w:cs="Arial" w:eastAsia="Arial" w:hAnsi="Arial"/>
+        <w:u w:val="none"/>
+      </w:rPr>
+    </w:lvl>
+    <w:lvl w:ilvl="1">
+      <w:start w:val="1"/>
+      <w:numFmt w:val="bullet"/>
+      <w:lvlText w:val="○"/>
+      <w:lvlJc w:val="left"/>
+      <w:pPr>
+        <w:ind w:left="1440" w:hanging="360"/>
+      </w:pPr>
+      <w:rPr>
+        <w:u w:val="none"/>
+      </w:rPr>
+    </w:lvl>
+    <w:lvl w:ilvl="2">
+      <w:start w:val="1"/>
+      <w:numFmt w:val="bullet"/>
+      <w:lvlText w:val="■"/>
+      <w:lvlJc w:val="left"/>
+      <w:pPr>
+        <w:ind w:left="2160" w:hanging="360"/>
+      </w:pPr>
+      <w:rPr>
+        <w:u w:val="none"/>
+      </w:rPr>
+    </w:lvl>
+    <w:lvl w:ilvl="3">
+      <w:start w:val="1"/>
+      <w:numFmt w:val="bullet"/>
+      <w:lvlText w:val="●"/>
+      <w:lvlJc w:val="left"/>
+      <w:pPr>
+        <w:ind w:left="2880" w:hanging="360"/>
+      </w:pPr>
+      <w:rPr>
+        <w:u w:val="none"/>
+      </w:rPr>
+    </w:lvl>
+    <w:lvl w:ilvl="4">
+      <w:start w:val="1"/>
+      <w:numFmt w:val="bullet"/>
+      <w:lvlText w:val="○"/>
+      <w:lvlJc w:val="left"/>
+      <w:pPr>
+        <w:ind w:left="3600" w:hanging="360"/>
+      </w:pPr>
+      <w:rPr>
+        <w:u w:val="none"/>
+      </w:rPr>
+    </w:lvl>
+    <w:lvl w:ilvl="5">
+      <w:start w:val="1"/>
+      <w:numFmt w:val="bullet"/>
+      <w:lvlText w:val="■"/>
+      <w:lvlJc w:val="left"/>
+      <w:pPr>
+        <w:ind w:left="4320" w:hanging="360"/>
+      </w:pPr>
+      <w:rPr>
+        <w:u w:val="none"/>
+      </w:rPr>
+    </w:lvl>
+    <w:lvl w:ilvl="6">
+      <w:start w:val="1"/>
+      <w:numFmt w:val="bullet"/>
+      <w:lvlText w:val="●"/>
+      <w:lvlJc w:val="left"/>
+      <w:pPr>
+        <w:ind w:left="5040" w:hanging="360"/>
+      </w:pPr>
+      <w:rPr>
+        <w:u w:val="none"/>
+      </w:rPr>
+    </w:lvl>
+    <w:lvl w:ilvl="7">
+      <w:start w:val="1"/>
+      <w:numFmt w:val="bullet"/>
+      <w:lvlText w:val="○"/>
+      <w:lvlJc w:val="left"/>
+      <w:pPr>
+        <w:ind w:left="5760" w:hanging="360"/>
+      </w:pPr>
+      <w:rPr>
+        <w:u w:val="none"/>
+      </w:rPr>
+    </w:lvl>
+    <w:lvl w:ilvl="8">
+      <w:start w:val="1"/>
+      <w:numFmt w:val="bullet"/>
+      <w:lvlText w:val="■"/>
+      <w:lvlJc w:val="left"/>
+      <w:pPr>
+        <w:ind w:left="6480" w:hanging="360"/>
+      </w:pPr>
+      <w:rPr>
+        <w:u w:val="none"/>
+      </w:rPr>
+    </w:lvl>
+  </w:abstractNum>
+  <w:abstractNum w:abstractNumId="3">
+    <w:lvl w:ilvl="0">
+      <w:start w:val="1"/>
+      <w:numFmt w:val="bullet"/>
+      <w:lvlText w:val="●"/>
+      <w:lvlJc w:val="left"/>
+      <w:pPr>
+        <w:ind w:left="720" w:hanging="360"/>
+      </w:pPr>
+      <w:rPr>
+        <w:rFonts w:ascii="Arial" w:cs="Arial" w:eastAsia="Arial" w:hAnsi="Arial"/>
+        <w:u w:val="none"/>
+      </w:rPr>
+    </w:lvl>
+    <w:lvl w:ilvl="1">
+      <w:start w:val="1"/>
+      <w:numFmt w:val="bullet"/>
+      <w:lvlText w:val="○"/>
+      <w:lvlJc w:val="left"/>
+      <w:pPr>
+        <w:ind w:left="1440" w:hanging="360"/>
+      </w:pPr>
+      <w:rPr>
+        <w:u w:val="none"/>
+      </w:rPr>
+    </w:lvl>
+    <w:lvl w:ilvl="2">
+      <w:start w:val="1"/>
+      <w:numFmt w:val="bullet"/>
+      <w:lvlText w:val="■"/>
+      <w:lvlJc w:val="left"/>
+      <w:pPr>
+        <w:ind w:left="2160" w:hanging="360"/>
+      </w:pPr>
+      <w:rPr>
+        <w:u w:val="none"/>
+      </w:rPr>
+    </w:lvl>
+    <w:lvl w:ilvl="3">
+      <w:start w:val="1"/>
+      <w:numFmt w:val="bullet"/>
+      <w:lvlText w:val="●"/>
+      <w:lvlJc w:val="left"/>
+      <w:pPr>
+        <w:ind w:left="2880" w:hanging="360"/>
+      </w:pPr>
+      <w:rPr>
+        <w:u w:val="none"/>
+      </w:rPr>
+    </w:lvl>
+    <w:lvl w:ilvl="4">
+      <w:start w:val="1"/>
+      <w:numFmt w:val="bullet"/>
+      <w:lvlText w:val="○"/>
+      <w:lvlJc w:val="left"/>
+      <w:pPr>
+        <w:ind w:left="3600" w:hanging="360"/>
+      </w:pPr>
+      <w:rPr>
+        <w:u w:val="none"/>
+      </w:rPr>
+    </w:lvl>
+    <w:lvl w:ilvl="5">
+      <w:start w:val="1"/>
+      <w:numFmt w:val="bullet"/>
+      <w:lvlText w:val="■"/>
+      <w:lvlJc w:val="left"/>
+      <w:pPr>
+        <w:ind w:left="4320" w:hanging="360"/>
+      </w:pPr>
+      <w:rPr>
+        <w:u w:val="none"/>
+      </w:rPr>
+    </w:lvl>
+    <w:lvl w:ilvl="6">
+      <w:start w:val="1"/>
+      <w:numFmt w:val="bullet"/>
+      <w:lvlText w:val="●"/>
+      <w:lvlJc w:val="left"/>
+      <w:pPr>
+        <w:ind w:left="5040" w:hanging="360"/>
+      </w:pPr>
+      <w:rPr>
+        <w:u w:val="none"/>
+      </w:rPr>
+    </w:lvl>
+    <w:lvl w:ilvl="7">
+      <w:start w:val="1"/>
+      <w:numFmt w:val="bullet"/>
+      <w:lvlText w:val="○"/>
+      <w:lvlJc w:val="left"/>
+      <w:pPr>
+        <w:ind w:left="5760" w:hanging="360"/>
+      </w:pPr>
+      <w:rPr>
+        <w:u w:val="none"/>
+      </w:rPr>
+    </w:lvl>
+    <w:lvl w:ilvl="8">
+      <w:start w:val="1"/>
+      <w:numFmt w:val="bullet"/>
+      <w:lvlText w:val="■"/>
+      <w:lvlJc w:val="left"/>
+      <w:pPr>
+        <w:ind w:left="6480" w:hanging="360"/>
+      </w:pPr>
+      <w:rPr>
+        <w:u w:val="none"/>
+      </w:rPr>
+    </w:lvl>
+  </w:abstractNum>
+  <w:abstractNum w:abstractNumId="4">
+    <w:lvl w:ilvl="0">
+      <w:start w:val="1"/>
+      <w:numFmt w:val="bullet"/>
+      <w:lvlText w:val="●"/>
+      <w:lvlJc w:val="left"/>
+      <w:pPr>
+        <w:ind w:left="720" w:hanging="360"/>
+      </w:pPr>
+      <w:rPr>
+        <w:rFonts w:ascii="Arial" w:cs="Arial" w:eastAsia="Arial" w:hAnsi="Arial"/>
+        <w:u w:val="none"/>
+      </w:rPr>
+    </w:lvl>
+    <w:lvl w:ilvl="1">
+      <w:start w:val="1"/>
+      <w:numFmt w:val="bullet"/>
+      <w:lvlText w:val="○"/>
+      <w:lvlJc w:val="left"/>
+      <w:pPr>
+        <w:ind w:left="1440" w:hanging="360"/>
+      </w:pPr>
+      <w:rPr>
+        <w:u w:val="none"/>
+      </w:rPr>
+    </w:lvl>
+    <w:lvl w:ilvl="2">
+      <w:start w:val="1"/>
+      <w:numFmt w:val="bullet"/>
+      <w:lvlText w:val="■"/>
+      <w:lvlJc w:val="left"/>
+      <w:pPr>
+        <w:ind w:left="2160" w:hanging="360"/>
+      </w:pPr>
+      <w:rPr>
+        <w:u w:val="none"/>
+      </w:rPr>
+    </w:lvl>
+    <w:lvl w:ilvl="3">
+      <w:start w:val="1"/>
+      <w:numFmt w:val="bullet"/>
+      <w:lvlText w:val="●"/>
+      <w:lvlJc w:val="left"/>
+      <w:pPr>
+        <w:ind w:left="2880" w:hanging="360"/>
+      </w:pPr>
+      <w:rPr>
+        <w:u w:val="none"/>
+      </w:rPr>
+    </w:lvl>
+    <w:lvl w:ilvl="4">
+      <w:start w:val="1"/>
+      <w:numFmt w:val="bullet"/>
+      <w:lvlText w:val="○"/>
+      <w:lvlJc w:val="left"/>
+      <w:pPr>
+        <w:ind w:left="3600" w:hanging="360"/>
+      </w:pPr>
+      <w:rPr>
+        <w:u w:val="none"/>
+      </w:rPr>
+    </w:lvl>
+    <w:lvl w:ilvl="5">
+      <w:start w:val="1"/>
+      <w:numFmt w:val="bullet"/>
+      <w:lvlText w:val="■"/>
+      <w:lvlJc w:val="left"/>
+      <w:pPr>
+        <w:ind w:left="4320" w:hanging="360"/>
+      </w:pPr>
+      <w:rPr>
+        <w:u w:val="none"/>
+      </w:rPr>
+    </w:lvl>
+    <w:lvl w:ilvl="6">
+      <w:start w:val="1"/>
+      <w:numFmt w:val="bullet"/>
+      <w:lvlText w:val="●"/>
+      <w:lvlJc w:val="left"/>
+      <w:pPr>
+        <w:ind w:left="5040" w:hanging="360"/>
+      </w:pPr>
+      <w:rPr>
+        <w:u w:val="none"/>
+      </w:rPr>
+    </w:lvl>
+    <w:lvl w:ilvl="7">
+      <w:start w:val="1"/>
+      <w:numFmt w:val="bullet"/>
+      <w:lvlText w:val="○"/>
+      <w:lvlJc w:val="left"/>
+      <w:pPr>
+        <w:ind w:left="5760" w:hanging="360"/>
+      </w:pPr>
+      <w:rPr>
+        <w:u w:val="none"/>
+      </w:rPr>
+    </w:lvl>
+    <w:lvl w:ilvl="8">
+      <w:start w:val="1"/>
+      <w:numFmt w:val="bullet"/>
+      <w:lvlText w:val="■"/>
+      <w:lvlJc w:val="left"/>
+      <w:pPr>
+        <w:ind w:left="6480" w:hanging="360"/>
+      </w:pPr>
+      <w:rPr>
+        <w:u w:val="none"/>
+      </w:rPr>
+    </w:lvl>
+  </w:abstractNum>
+  <w:abstractNum w:abstractNumId="5">
+    <w:lvl w:ilvl="0">
+      <w:start w:val="1"/>
+      <w:numFmt w:val="bullet"/>
+      <w:lvlText w:val="●"/>
+      <w:lvlJc w:val="left"/>
+      <w:pPr>
+        <w:ind w:left="720" w:hanging="360"/>
+      </w:pPr>
+      <w:rPr>
+        <w:rFonts w:ascii="Arial" w:cs="Arial" w:eastAsia="Arial" w:hAnsi="Arial"/>
+        <w:u w:val="none"/>
+      </w:rPr>
+    </w:lvl>
+    <w:lvl w:ilvl="1">
+      <w:start w:val="1"/>
+      <w:numFmt w:val="bullet"/>
+      <w:lvlText w:val="○"/>
+      <w:lvlJc w:val="left"/>
+      <w:pPr>
+        <w:ind w:left="1440" w:hanging="360"/>
+      </w:pPr>
+      <w:rPr>
+        <w:u w:val="none"/>
+      </w:rPr>
+    </w:lvl>
+    <w:lvl w:ilvl="2">
+      <w:start w:val="1"/>
+      <w:numFmt w:val="bullet"/>
+      <w:lvlText w:val="■"/>
+      <w:lvlJc w:val="left"/>
+      <w:pPr>
+        <w:ind w:left="2160" w:hanging="360"/>
+      </w:pPr>
+      <w:rPr>
+        <w:u w:val="none"/>
+      </w:rPr>
+    </w:lvl>
+    <w:lvl w:ilvl="3">
+      <w:start w:val="1"/>
+      <w:numFmt w:val="bullet"/>
+      <w:lvlText w:val="●"/>
+      <w:lvlJc w:val="left"/>
+      <w:pPr>
+        <w:ind w:left="2880" w:hanging="360"/>
+      </w:pPr>
+      <w:rPr>
+        <w:u w:val="none"/>
+      </w:rPr>
+    </w:lvl>
+    <w:lvl w:ilvl="4">
+      <w:start w:val="1"/>
+      <w:numFmt w:val="bullet"/>
+      <w:lvlText w:val="○"/>
+      <w:lvlJc w:val="left"/>
+      <w:pPr>
+        <w:ind w:left="3600" w:hanging="360"/>
+      </w:pPr>
+      <w:rPr>
+        <w:u w:val="none"/>
+      </w:rPr>
+    </w:lvl>
+    <w:lvl w:ilvl="5">
+      <w:start w:val="1"/>
+      <w:numFmt w:val="bullet"/>
+      <w:lvlText w:val="■"/>
+      <w:lvlJc w:val="left"/>
+      <w:pPr>
+        <w:ind w:left="4320" w:hanging="360"/>
+      </w:pPr>
+      <w:rPr>
+        <w:u w:val="none"/>
+      </w:rPr>
+    </w:lvl>
+    <w:lvl w:ilvl="6">
+      <w:start w:val="1"/>
+      <w:numFmt w:val="bullet"/>
+      <w:lvlText w:val="●"/>
+      <w:lvlJc w:val="left"/>
+      <w:pPr>
+        <w:ind w:left="5040" w:hanging="360"/>
+      </w:pPr>
+      <w:rPr>
+        <w:u w:val="none"/>
+      </w:rPr>
+    </w:lvl>
+    <w:lvl w:ilvl="7">
+      <w:start w:val="1"/>
+      <w:numFmt w:val="bullet"/>
+      <w:lvlText w:val="○"/>
+      <w:lvlJc w:val="left"/>
+      <w:pPr>
+        <w:ind w:left="5760" w:hanging="360"/>
+      </w:pPr>
+      <w:rPr>
+        <w:u w:val="none"/>
+      </w:rPr>
+    </w:lvl>
+    <w:lvl w:ilvl="8">
+      <w:start w:val="1"/>
+      <w:numFmt w:val="bullet"/>
+      <w:lvlText w:val="■"/>
+      <w:lvlJc w:val="left"/>
+      <w:pPr>
+        <w:ind w:left="6480" w:hanging="360"/>
+      </w:pPr>
+      <w:rPr>
+        <w:u w:val="none"/>
+      </w:rPr>
+    </w:lvl>
+  </w:abstractNum>
+  <w:abstractNum w:abstractNumId="6">
+    <w:lvl w:ilvl="0">
+      <w:start w:val="1"/>
+      <w:numFmt w:val="bullet"/>
+      <w:lvlText w:val="●"/>
+      <w:lvlJc w:val="left"/>
+      <w:pPr>
+        <w:ind w:left="720" w:hanging="360"/>
+      </w:pPr>
+      <w:rPr>
+        <w:rFonts w:ascii="Arial" w:cs="Arial" w:eastAsia="Arial" w:hAnsi="Arial"/>
+        <w:u w:val="none"/>
+      </w:rPr>
+    </w:lvl>
+    <w:lvl w:ilvl="1">
+      <w:start w:val="1"/>
+      <w:numFmt w:val="bullet"/>
+      <w:lvlText w:val="○"/>
+      <w:lvlJc w:val="left"/>
+      <w:pPr>
+        <w:ind w:left="1440" w:hanging="360"/>
+      </w:pPr>
+      <w:rPr>
+        <w:u w:val="none"/>
+      </w:rPr>
+    </w:lvl>
+    <w:lvl w:ilvl="2">
+      <w:start w:val="1"/>
+      <w:numFmt w:val="bullet"/>
+      <w:lvlText w:val="■"/>
+      <w:lvlJc w:val="left"/>
+      <w:pPr>
+        <w:ind w:left="2160" w:hanging="360"/>
+      </w:pPr>
+      <w:rPr>
+        <w:u w:val="none"/>
+      </w:rPr>
+    </w:lvl>
+    <w:lvl w:ilvl="3">
+      <w:start w:val="1"/>
+      <w:numFmt w:val="bullet"/>
+      <w:lvlText w:val="●"/>
+      <w:lvlJc w:val="left"/>
+      <w:pPr>
+        <w:ind w:left="2880" w:hanging="360"/>
+      </w:pPr>
+      <w:rPr>
+        <w:u w:val="none"/>
+      </w:rPr>
+    </w:lvl>
+    <w:lvl w:ilvl="4">
+      <w:start w:val="1"/>
+      <w:numFmt w:val="bullet"/>
+      <w:lvlText w:val="○"/>
+      <w:lvlJc w:val="left"/>
+      <w:pPr>
+        <w:ind w:left="3600" w:hanging="360"/>
+      </w:pPr>
+      <w:rPr>
+        <w:u w:val="none"/>
+      </w:rPr>
+    </w:lvl>
+    <w:lvl w:ilvl="5">
+      <w:start w:val="1"/>
+      <w:numFmt w:val="bullet"/>
+      <w:lvlText w:val="■"/>
+      <w:lvlJc w:val="left"/>
+      <w:pPr>
+        <w:ind w:left="4320" w:hanging="360"/>
+      </w:pPr>
+      <w:rPr>
+        <w:u w:val="none"/>
+      </w:rPr>
+    </w:lvl>
+    <w:lvl w:ilvl="6">
+      <w:start w:val="1"/>
+      <w:numFmt w:val="bullet"/>
+      <w:lvlText w:val="●"/>
+      <w:lvlJc w:val="left"/>
+      <w:pPr>
+        <w:ind w:left="5040" w:hanging="360"/>
+      </w:pPr>
+      <w:rPr>
+        <w:u w:val="none"/>
+      </w:rPr>
+    </w:lvl>
+    <w:lvl w:ilvl="7">
+      <w:start w:val="1"/>
+      <w:numFmt w:val="bullet"/>
+      <w:lvlText w:val="○"/>
+      <w:lvlJc w:val="left"/>
+      <w:pPr>
+        <w:ind w:left="5760" w:hanging="360"/>
+      </w:pPr>
+      <w:rPr>
+        <w:u w:val="none"/>
+      </w:rPr>
+    </w:lvl>
+    <w:lvl w:ilvl="8">
+      <w:start w:val="1"/>
+      <w:numFmt w:val="bullet"/>
+      <w:lvlText w:val="■"/>
+      <w:lvlJc w:val="left"/>
+      <w:pPr>
+        <w:ind w:left="6480" w:hanging="360"/>
+      </w:pPr>
+      <w:rPr>
+        <w:u w:val="none"/>
+      </w:rPr>
+    </w:lvl>
+  </w:abstractNum>
+  <w:abstractNum w:abstractNumId="7">
+    <w:lvl w:ilvl="0">
+      <w:start w:val="1"/>
+      <w:numFmt w:val="bullet"/>
+      <w:lvlText w:val="●"/>
+      <w:lvlJc w:val="left"/>
+      <w:pPr>
+        <w:ind w:left="720" w:hanging="360"/>
+      </w:pPr>
+      <w:rPr>
+        <w:rFonts w:ascii="Arial" w:cs="Arial" w:eastAsia="Arial" w:hAnsi="Arial"/>
+        <w:u w:val="none"/>
+      </w:rPr>
+    </w:lvl>
+    <w:lvl w:ilvl="1">
+      <w:start w:val="1"/>
+      <w:numFmt w:val="bullet"/>
+      <w:lvlText w:val="○"/>
+      <w:lvlJc w:val="left"/>
+      <w:pPr>
+        <w:ind w:left="1440" w:hanging="360"/>
+      </w:pPr>
+      <w:rPr>
+        <w:u w:val="none"/>
+      </w:rPr>
+    </w:lvl>
+    <w:lvl w:ilvl="2">
+      <w:start w:val="1"/>
+      <w:numFmt w:val="bullet"/>
+      <w:lvlText w:val="■"/>
+      <w:lvlJc w:val="left"/>
+      <w:pPr>
+        <w:ind w:left="2160" w:hanging="360"/>
+      </w:pPr>
+      <w:rPr>
+        <w:u w:val="none"/>
+      </w:rPr>
+    </w:lvl>
+    <w:lvl w:ilvl="3">
+      <w:start w:val="1"/>
+      <w:numFmt w:val="bullet"/>
+      <w:lvlText w:val="●"/>
+      <w:lvlJc w:val="left"/>
+      <w:pPr>
+        <w:ind w:left="2880" w:hanging="360"/>
+      </w:pPr>
+      <w:rPr>
+        <w:u w:val="none"/>
+      </w:rPr>
+    </w:lvl>
+    <w:lvl w:ilvl="4">
+      <w:start w:val="1"/>
+      <w:numFmt w:val="bullet"/>
+      <w:lvlText w:val="○"/>
+      <w:lvlJc w:val="left"/>
+      <w:pPr>
+        <w:ind w:left="3600" w:hanging="360"/>
+      </w:pPr>
+      <w:rPr>
+        <w:u w:val="none"/>
+      </w:rPr>
+    </w:lvl>
+    <w:lvl w:ilvl="5">
+      <w:start w:val="1"/>
+      <w:numFmt w:val="bullet"/>
+      <w:lvlText w:val="■"/>
+      <w:lvlJc w:val="left"/>
+      <w:pPr>
+        <w:ind w:left="4320" w:hanging="360"/>
+      </w:pPr>
+      <w:rPr>
+        <w:u w:val="none"/>
+      </w:rPr>
+    </w:lvl>
+    <w:lvl w:ilvl="6">
+      <w:start w:val="1"/>
+      <w:numFmt w:val="bullet"/>
+      <w:lvlText w:val="●"/>
+      <w:lvlJc w:val="left"/>
+      <w:pPr>
+        <w:ind w:left="5040" w:hanging="360"/>
+      </w:pPr>
+      <w:rPr>
+        <w:u w:val="none"/>
+      </w:rPr>
+    </w:lvl>
+    <w:lvl w:ilvl="7">
+      <w:start w:val="1"/>
+      <w:numFmt w:val="bullet"/>
+      <w:lvlText w:val="○"/>
+      <w:lvlJc w:val="left"/>
+      <w:pPr>
+        <w:ind w:left="5760" w:hanging="360"/>
+      </w:pPr>
+      <w:rPr>
+        <w:u w:val="none"/>
+      </w:rPr>
+    </w:lvl>
+    <w:lvl w:ilvl="8">
+      <w:start w:val="1"/>
+      <w:numFmt w:val="bullet"/>
+      <w:lvlText w:val="■"/>
+      <w:lvlJc w:val="left"/>
+      <w:pPr>
+        <w:ind w:left="6480" w:hanging="360"/>
+      </w:pPr>
+      <w:rPr>
+        <w:u w:val="none"/>
+      </w:rPr>
+    </w:lvl>
+  </w:abstractNum>
+  <w:abstractNum w:abstractNumId="8">
+    <w:lvl w:ilvl="0">
+      <w:start w:val="1"/>
+      <w:numFmt w:val="bullet"/>
+      <w:lvlText w:val="●"/>
+      <w:lvlJc w:val="left"/>
+      <w:pPr>
+        <w:ind w:left="720" w:hanging="360"/>
+      </w:pPr>
+      <w:rPr>
+        <w:rFonts w:ascii="Arial" w:cs="Arial" w:eastAsia="Arial" w:hAnsi="Arial"/>
+        <w:u w:val="none"/>
+      </w:rPr>
+    </w:lvl>
+    <w:lvl w:ilvl="1">
+      <w:start w:val="1"/>
+      <w:numFmt w:val="bullet"/>
+      <w:lvlText w:val="○"/>
+      <w:lvlJc w:val="left"/>
+      <w:pPr>
+        <w:ind w:left="1440" w:hanging="360"/>
+      </w:pPr>
+      <w:rPr>
+        <w:u w:val="none"/>
+      </w:rPr>
+    </w:lvl>
+    <w:lvl w:ilvl="2">
+      <w:start w:val="1"/>
+      <w:numFmt w:val="bullet"/>
+      <w:lvlText w:val="■"/>
+      <w:lvlJc w:val="left"/>
+      <w:pPr>
+        <w:ind w:left="2160" w:hanging="360"/>
+      </w:pPr>
+      <w:rPr>
+        <w:u w:val="none"/>
+      </w:rPr>
+    </w:lvl>
+    <w:lvl w:ilvl="3">
+      <w:start w:val="1"/>
+      <w:numFmt w:val="bullet"/>
+      <w:lvlText w:val="●"/>
+      <w:lvlJc w:val="left"/>
+      <w:pPr>
+        <w:ind w:left="2880" w:hanging="360"/>
+      </w:pPr>
+      <w:rPr>
+        <w:u w:val="none"/>
+      </w:rPr>
+    </w:lvl>
+    <w:lvl w:ilvl="4">
+      <w:start w:val="1"/>
+      <w:numFmt w:val="bullet"/>
+      <w:lvlText w:val="○"/>
+      <w:lvlJc w:val="left"/>
+      <w:pPr>
+        <w:ind w:left="3600" w:hanging="360"/>
+      </w:pPr>
+      <w:rPr>
+        <w:u w:val="none"/>
+      </w:rPr>
+    </w:lvl>
+    <w:lvl w:ilvl="5">
+      <w:start w:val="1"/>
+      <w:numFmt w:val="bullet"/>
+      <w:lvlText w:val="■"/>
+      <w:lvlJc w:val="left"/>
+      <w:pPr>
+        <w:ind w:left="4320" w:hanging="360"/>
+      </w:pPr>
+      <w:rPr>
+        <w:u w:val="none"/>
+      </w:rPr>
+    </w:lvl>
+    <w:lvl w:ilvl="6">
+      <w:start w:val="1"/>
+      <w:numFmt w:val="bullet"/>
+      <w:lvlText w:val="●"/>
+      <w:lvlJc w:val="left"/>
+      <w:pPr>
+        <w:ind w:left="5040" w:hanging="360"/>
+      </w:pPr>
+      <w:rPr>
+        <w:u w:val="none"/>
+      </w:rPr>
+    </w:lvl>
+    <w:lvl w:ilvl="7">
+      <w:start w:val="1"/>
+      <w:numFmt w:val="bullet"/>
+      <w:lvlText w:val="○"/>
+      <w:lvlJc w:val="left"/>
+      <w:pPr>
+        <w:ind w:left="5760" w:hanging="360"/>
+      </w:pPr>
+      <w:rPr>
+        <w:u w:val="none"/>
+      </w:rPr>
+    </w:lvl>
+    <w:lvl w:ilvl="8">
+      <w:start w:val="1"/>
+      <w:numFmt w:val="bullet"/>
+      <w:lvlText w:val="■"/>
+      <w:lvlJc w:val="left"/>
+      <w:pPr>
+        <w:ind w:left="6480" w:hanging="360"/>
+      </w:pPr>
+      <w:rPr>
+        <w:u w:val="none"/>
+      </w:rPr>
+    </w:lvl>
+  </w:abstractNum>
+  <w:abstractNum w:abstractNumId="9">
+    <w:lvl w:ilvl="0">
+      <w:start w:val="1"/>
+      <w:numFmt w:val="bullet"/>
+      <w:lvlText w:val="●"/>
+      <w:lvlJc w:val="left"/>
+      <w:pPr>
+        <w:ind w:left="720" w:hanging="360"/>
+      </w:pPr>
+      <w:rPr>
+        <w:rFonts w:ascii="Arial" w:cs="Arial" w:eastAsia="Arial" w:hAnsi="Arial"/>
+        <w:u w:val="none"/>
+      </w:rPr>
+    </w:lvl>
+    <w:lvl w:ilvl="1">
+      <w:start w:val="1"/>
+      <w:numFmt w:val="bullet"/>
+      <w:lvlText w:val="○"/>
+      <w:lvlJc w:val="left"/>
+      <w:pPr>
+        <w:ind w:left="1440" w:hanging="360"/>
+      </w:pPr>
+      <w:rPr>
+        <w:u w:val="none"/>
+      </w:rPr>
+    </w:lvl>
+    <w:lvl w:ilvl="2">
+      <w:start w:val="1"/>
+      <w:numFmt w:val="bullet"/>
+      <w:lvlText w:val="■"/>
+      <w:lvlJc w:val="left"/>
+      <w:pPr>
+        <w:ind w:left="2160" w:hanging="360"/>
+      </w:pPr>
+      <w:rPr>
+        <w:u w:val="none"/>
+      </w:rPr>
+    </w:lvl>
+    <w:lvl w:ilvl="3">
+      <w:start w:val="1"/>
+      <w:numFmt w:val="bullet"/>
+      <w:lvlText w:val="●"/>
+      <w:lvlJc w:val="left"/>
+      <w:pPr>
+        <w:ind w:left="2880" w:hanging="360"/>
+      </w:pPr>
+      <w:rPr>
+        <w:u w:val="none"/>
+      </w:rPr>
+    </w:lvl>
+    <w:lvl w:ilvl="4">
+      <w:start w:val="1"/>
+      <w:numFmt w:val="bullet"/>
+      <w:lvlText w:val="○"/>
+      <w:lvlJc w:val="left"/>
+      <w:pPr>
+        <w:ind w:left="3600" w:hanging="360"/>
+      </w:pPr>
+      <w:rPr>
+        <w:u w:val="none"/>
+      </w:rPr>
+    </w:lvl>
+    <w:lvl w:ilvl="5">
+      <w:start w:val="1"/>
+      <w:numFmt w:val="bullet"/>
+      <w:lvlText w:val="■"/>
+      <w:lvlJc w:val="left"/>
+      <w:pPr>
+        <w:ind w:left="4320" w:hanging="360"/>
+      </w:pPr>
+      <w:rPr>
+        <w:u w:val="none"/>
+      </w:rPr>
+    </w:lvl>
+    <w:lvl w:ilvl="6">
+      <w:start w:val="1"/>
+      <w:numFmt w:val="bullet"/>
+      <w:lvlText w:val="●"/>
+      <w:lvlJc w:val="left"/>
+      <w:pPr>
+        <w:ind w:left="5040" w:hanging="360"/>
+      </w:pPr>
+      <w:rPr>
+        <w:u w:val="none"/>
+      </w:rPr>
+    </w:lvl>
+    <w:lvl w:ilvl="7">
+      <w:start w:val="1"/>
+      <w:numFmt w:val="bullet"/>
+      <w:lvlText w:val="○"/>
+      <w:lvlJc w:val="left"/>
+      <w:pPr>
+        <w:ind w:left="5760" w:hanging="360"/>
+      </w:pPr>
+      <w:rPr>
+        <w:u w:val="none"/>
+      </w:rPr>
+    </w:lvl>
+    <w:lvl w:ilvl="8">
+      <w:start w:val="1"/>
+      <w:numFmt w:val="bullet"/>
+      <w:lvlText w:val="■"/>
+      <w:lvlJc w:val="left"/>
+      <w:pPr>
+        <w:ind w:left="6480" w:hanging="360"/>
+      </w:pPr>
+      <w:rPr>
+        <w:u w:val="none"/>
+      </w:rPr>
+    </w:lvl>
+  </w:abstractNum>
+  <w:abstractNum w:abstractNumId="10">
+    <w:lvl w:ilvl="0">
+      <w:start w:val="1"/>
       <w:numFmt w:val="upperLetter"/>
       <w:lvlText w:val="%1."/>
       <w:lvlJc w:val="left"/>
@@ -7617,190 +9269,448 @@
       <w:rPr/>
     </w:lvl>
   </w:abstractNum>
-  <w:abstractNum w:abstractNumId="2">
+  <w:abstractNum w:abstractNumId="11">
     <w:lvl w:ilvl="0">
       <w:start w:val="1"/>
-      <w:numFmt w:val="decimal"/>
-      <w:lvlText w:val="(%1)"/>
+      <w:numFmt w:val="bullet"/>
+      <w:lvlText w:val="●"/>
       <w:lvlJc w:val="left"/>
       <w:pPr>
         <w:ind w:left="720" w:hanging="360"/>
       </w:pPr>
-      <w:rPr/>
+      <w:rPr>
+        <w:rFonts w:ascii="Arial" w:cs="Arial" w:eastAsia="Arial" w:hAnsi="Arial"/>
+        <w:u w:val="none"/>
+      </w:rPr>
     </w:lvl>
     <w:lvl w:ilvl="1">
       <w:start w:val="1"/>
-      <w:numFmt w:val="lowerLetter"/>
-      <w:lvlText w:val="%2."/>
+      <w:numFmt w:val="bullet"/>
+      <w:lvlText w:val="○"/>
       <w:lvlJc w:val="left"/>
       <w:pPr>
         <w:ind w:left="1440" w:hanging="360"/>
       </w:pPr>
-      <w:rPr/>
+      <w:rPr>
+        <w:u w:val="none"/>
+      </w:rPr>
     </w:lvl>
     <w:lvl w:ilvl="2">
       <w:start w:val="1"/>
-      <w:numFmt w:val="lowerRoman"/>
-      <w:lvlText w:val="%3."/>
-      <w:lvlJc w:val="right"/>
-      <w:pPr>
-        <w:ind w:left="2160" w:hanging="180"/>
-      </w:pPr>
-      <w:rPr/>
+      <w:numFmt w:val="bullet"/>
+      <w:lvlText w:val="■"/>
+      <w:lvlJc w:val="left"/>
+      <w:pPr>
+        <w:ind w:left="2160" w:hanging="360"/>
+      </w:pPr>
+      <w:rPr>
+        <w:u w:val="none"/>
+      </w:rPr>
     </w:lvl>
     <w:lvl w:ilvl="3">
       <w:start w:val="1"/>
-      <w:numFmt w:val="decimal"/>
-      <w:lvlText w:val="%4."/>
+      <w:numFmt w:val="bullet"/>
+      <w:lvlText w:val="●"/>
       <w:lvlJc w:val="left"/>
       <w:pPr>
         <w:ind w:left="2880" w:hanging="360"/>
       </w:pPr>
-      <w:rPr/>
+      <w:rPr>
+        <w:u w:val="none"/>
+      </w:rPr>
     </w:lvl>
     <w:lvl w:ilvl="4">
       <w:start w:val="1"/>
-      <w:numFmt w:val="lowerLetter"/>
-      <w:lvlText w:val="%5."/>
+      <w:numFmt w:val="bullet"/>
+      <w:lvlText w:val="○"/>
       <w:lvlJc w:val="left"/>
       <w:pPr>
         <w:ind w:left="3600" w:hanging="360"/>
       </w:pPr>
-      <w:rPr/>
+      <w:rPr>
+        <w:u w:val="none"/>
+      </w:rPr>
     </w:lvl>
     <w:lvl w:ilvl="5">
       <w:start w:val="1"/>
-      <w:numFmt w:val="lowerRoman"/>
-      <w:lvlText w:val="%6."/>
-      <w:lvlJc w:val="right"/>
-      <w:pPr>
-        <w:ind w:left="4320" w:hanging="180"/>
-      </w:pPr>
-      <w:rPr/>
+      <w:numFmt w:val="bullet"/>
+      <w:lvlText w:val="■"/>
+      <w:lvlJc w:val="left"/>
+      <w:pPr>
+        <w:ind w:left="4320" w:hanging="360"/>
+      </w:pPr>
+      <w:rPr>
+        <w:u w:val="none"/>
+      </w:rPr>
     </w:lvl>
     <w:lvl w:ilvl="6">
       <w:start w:val="1"/>
-      <w:numFmt w:val="decimal"/>
-      <w:lvlText w:val="%7."/>
+      <w:numFmt w:val="bullet"/>
+      <w:lvlText w:val="●"/>
       <w:lvlJc w:val="left"/>
       <w:pPr>
         <w:ind w:left="5040" w:hanging="360"/>
       </w:pPr>
-      <w:rPr/>
+      <w:rPr>
+        <w:u w:val="none"/>
+      </w:rPr>
     </w:lvl>
     <w:lvl w:ilvl="7">
       <w:start w:val="1"/>
-      <w:numFmt w:val="lowerLetter"/>
-      <w:lvlText w:val="%8."/>
+      <w:numFmt w:val="bullet"/>
+      <w:lvlText w:val="○"/>
       <w:lvlJc w:val="left"/>
       <w:pPr>
         <w:ind w:left="5760" w:hanging="360"/>
       </w:pPr>
-      <w:rPr/>
+      <w:rPr>
+        <w:u w:val="none"/>
+      </w:rPr>
     </w:lvl>
     <w:lvl w:ilvl="8">
       <w:start w:val="1"/>
-      <w:numFmt w:val="lowerRoman"/>
-      <w:lvlText w:val="%9."/>
-      <w:lvlJc w:val="right"/>
-      <w:pPr>
-        <w:ind w:left="6480" w:hanging="180"/>
-      </w:pPr>
-      <w:rPr/>
+      <w:numFmt w:val="bullet"/>
+      <w:lvlText w:val="■"/>
+      <w:lvlJc w:val="left"/>
+      <w:pPr>
+        <w:ind w:left="6480" w:hanging="360"/>
+      </w:pPr>
+      <w:rPr>
+        <w:u w:val="none"/>
+      </w:rPr>
     </w:lvl>
   </w:abstractNum>
-  <w:abstractNum w:abstractNumId="3">
+  <w:abstractNum w:abstractNumId="12">
     <w:lvl w:ilvl="0">
       <w:start w:val="1"/>
       <w:numFmt w:val="bullet"/>
       <w:lvlText w:val="●"/>
       <w:lvlJc w:val="left"/>
       <w:pPr>
-        <w:ind w:left="1080" w:hanging="360"/>
-      </w:pPr>
-      <w:rPr>
-        <w:rFonts w:ascii="Noto Sans Symbols" w:cs="Noto Sans Symbols" w:eastAsia="Noto Sans Symbols" w:hAnsi="Noto Sans Symbols"/>
+        <w:ind w:left="720" w:hanging="360"/>
+      </w:pPr>
+      <w:rPr>
+        <w:rFonts w:ascii="Arial" w:cs="Arial" w:eastAsia="Arial" w:hAnsi="Arial"/>
+        <w:u w:val="none"/>
       </w:rPr>
     </w:lvl>
     <w:lvl w:ilvl="1">
       <w:start w:val="1"/>
-      <w:numFmt w:val="lowerLetter"/>
-      <w:lvlText w:val="%2."/>
-      <w:lvlJc w:val="left"/>
-      <w:pPr>
-        <w:ind w:left="1800" w:hanging="360"/>
-      </w:pPr>
-      <w:rPr/>
+      <w:numFmt w:val="bullet"/>
+      <w:lvlText w:val="○"/>
+      <w:lvlJc w:val="left"/>
+      <w:pPr>
+        <w:ind w:left="1440" w:hanging="360"/>
+      </w:pPr>
+      <w:rPr>
+        <w:u w:val="none"/>
+      </w:rPr>
     </w:lvl>
     <w:lvl w:ilvl="2">
       <w:start w:val="1"/>
-      <w:numFmt w:val="lowerRoman"/>
-      <w:lvlText w:val="%3."/>
-      <w:lvlJc w:val="right"/>
-      <w:pPr>
-        <w:ind w:left="2520" w:hanging="180"/>
-      </w:pPr>
-      <w:rPr/>
+      <w:numFmt w:val="bullet"/>
+      <w:lvlText w:val="■"/>
+      <w:lvlJc w:val="left"/>
+      <w:pPr>
+        <w:ind w:left="2160" w:hanging="360"/>
+      </w:pPr>
+      <w:rPr>
+        <w:u w:val="none"/>
+      </w:rPr>
     </w:lvl>
     <w:lvl w:ilvl="3">
       <w:start w:val="1"/>
-      <w:numFmt w:val="decimal"/>
-      <w:lvlText w:val="%4."/>
-      <w:lvlJc w:val="left"/>
-      <w:pPr>
-        <w:ind w:left="3240" w:hanging="360"/>
-      </w:pPr>
-      <w:rPr/>
+      <w:numFmt w:val="bullet"/>
+      <w:lvlText w:val="●"/>
+      <w:lvlJc w:val="left"/>
+      <w:pPr>
+        <w:ind w:left="2880" w:hanging="360"/>
+      </w:pPr>
+      <w:rPr>
+        <w:u w:val="none"/>
+      </w:rPr>
     </w:lvl>
     <w:lvl w:ilvl="4">
       <w:start w:val="1"/>
-      <w:numFmt w:val="lowerLetter"/>
-      <w:lvlText w:val="%5."/>
-      <w:lvlJc w:val="left"/>
-      <w:pPr>
-        <w:ind w:left="3960" w:hanging="360"/>
-      </w:pPr>
-      <w:rPr/>
+      <w:numFmt w:val="bullet"/>
+      <w:lvlText w:val="○"/>
+      <w:lvlJc w:val="left"/>
+      <w:pPr>
+        <w:ind w:left="3600" w:hanging="360"/>
+      </w:pPr>
+      <w:rPr>
+        <w:u w:val="none"/>
+      </w:rPr>
     </w:lvl>
     <w:lvl w:ilvl="5">
       <w:start w:val="1"/>
-      <w:numFmt w:val="lowerRoman"/>
-      <w:lvlText w:val="%6."/>
-      <w:lvlJc w:val="right"/>
-      <w:pPr>
-        <w:ind w:left="4680" w:hanging="180"/>
-      </w:pPr>
-      <w:rPr/>
+      <w:numFmt w:val="bullet"/>
+      <w:lvlText w:val="■"/>
+      <w:lvlJc w:val="left"/>
+      <w:pPr>
+        <w:ind w:left="4320" w:hanging="360"/>
+      </w:pPr>
+      <w:rPr>
+        <w:u w:val="none"/>
+      </w:rPr>
     </w:lvl>
     <w:lvl w:ilvl="6">
       <w:start w:val="1"/>
-      <w:numFmt w:val="decimal"/>
-      <w:lvlText w:val="%7."/>
-      <w:lvlJc w:val="left"/>
-      <w:pPr>
-        <w:ind w:left="5400" w:hanging="360"/>
-      </w:pPr>
-      <w:rPr/>
+      <w:numFmt w:val="bullet"/>
+      <w:lvlText w:val="●"/>
+      <w:lvlJc w:val="left"/>
+      <w:pPr>
+        <w:ind w:left="5040" w:hanging="360"/>
+      </w:pPr>
+      <w:rPr>
+        <w:u w:val="none"/>
+      </w:rPr>
     </w:lvl>
     <w:lvl w:ilvl="7">
       <w:start w:val="1"/>
-      <w:numFmt w:val="lowerLetter"/>
-      <w:lvlText w:val="%8."/>
-      <w:lvlJc w:val="left"/>
-      <w:pPr>
-        <w:ind w:left="6120" w:hanging="360"/>
-      </w:pPr>
-      <w:rPr/>
+      <w:numFmt w:val="bullet"/>
+      <w:lvlText w:val="○"/>
+      <w:lvlJc w:val="left"/>
+      <w:pPr>
+        <w:ind w:left="5760" w:hanging="360"/>
+      </w:pPr>
+      <w:rPr>
+        <w:u w:val="none"/>
+      </w:rPr>
     </w:lvl>
     <w:lvl w:ilvl="8">
       <w:start w:val="1"/>
-      <w:numFmt w:val="lowerRoman"/>
-      <w:lvlText w:val="%9."/>
-      <w:lvlJc w:val="right"/>
-      <w:pPr>
-        <w:ind w:left="6840" w:hanging="180"/>
-      </w:pPr>
-      <w:rPr/>
+      <w:numFmt w:val="bullet"/>
+      <w:lvlText w:val="■"/>
+      <w:lvlJc w:val="left"/>
+      <w:pPr>
+        <w:ind w:left="6480" w:hanging="360"/>
+      </w:pPr>
+      <w:rPr>
+        <w:u w:val="none"/>
+      </w:rPr>
+    </w:lvl>
+  </w:abstractNum>
+  <w:abstractNum w:abstractNumId="13">
+    <w:lvl w:ilvl="0">
+      <w:start w:val="1"/>
+      <w:numFmt w:val="bullet"/>
+      <w:lvlText w:val="●"/>
+      <w:lvlJc w:val="left"/>
+      <w:pPr>
+        <w:ind w:left="720" w:hanging="360"/>
+      </w:pPr>
+      <w:rPr>
+        <w:rFonts w:ascii="Arial" w:cs="Arial" w:eastAsia="Arial" w:hAnsi="Arial"/>
+        <w:u w:val="none"/>
+      </w:rPr>
+    </w:lvl>
+    <w:lvl w:ilvl="1">
+      <w:start w:val="1"/>
+      <w:numFmt w:val="bullet"/>
+      <w:lvlText w:val="○"/>
+      <w:lvlJc w:val="left"/>
+      <w:pPr>
+        <w:ind w:left="1440" w:hanging="360"/>
+      </w:pPr>
+      <w:rPr>
+        <w:u w:val="none"/>
+      </w:rPr>
+    </w:lvl>
+    <w:lvl w:ilvl="2">
+      <w:start w:val="1"/>
+      <w:numFmt w:val="bullet"/>
+      <w:lvlText w:val="■"/>
+      <w:lvlJc w:val="left"/>
+      <w:pPr>
+        <w:ind w:left="2160" w:hanging="360"/>
+      </w:pPr>
+      <w:rPr>
+        <w:u w:val="none"/>
+      </w:rPr>
+    </w:lvl>
+    <w:lvl w:ilvl="3">
+      <w:start w:val="1"/>
+      <w:numFmt w:val="bullet"/>
+      <w:lvlText w:val="●"/>
+      <w:lvlJc w:val="left"/>
+      <w:pPr>
+        <w:ind w:left="2880" w:hanging="360"/>
+      </w:pPr>
+      <w:rPr>
+        <w:u w:val="none"/>
+      </w:rPr>
+    </w:lvl>
+    <w:lvl w:ilvl="4">
+      <w:start w:val="1"/>
+      <w:numFmt w:val="bullet"/>
+      <w:lvlText w:val="○"/>
+      <w:lvlJc w:val="left"/>
+      <w:pPr>
+        <w:ind w:left="3600" w:hanging="360"/>
+      </w:pPr>
+      <w:rPr>
+        <w:u w:val="none"/>
+      </w:rPr>
+    </w:lvl>
+    <w:lvl w:ilvl="5">
+      <w:start w:val="1"/>
+      <w:numFmt w:val="bullet"/>
+      <w:lvlText w:val="■"/>
+      <w:lvlJc w:val="left"/>
+      <w:pPr>
+        <w:ind w:left="4320" w:hanging="360"/>
+      </w:pPr>
+      <w:rPr>
+        <w:u w:val="none"/>
+      </w:rPr>
+    </w:lvl>
+    <w:lvl w:ilvl="6">
+      <w:start w:val="1"/>
+      <w:numFmt w:val="bullet"/>
+      <w:lvlText w:val="●"/>
+      <w:lvlJc w:val="left"/>
+      <w:pPr>
+        <w:ind w:left="5040" w:hanging="360"/>
+      </w:pPr>
+      <w:rPr>
+        <w:u w:val="none"/>
+      </w:rPr>
+    </w:lvl>
+    <w:lvl w:ilvl="7">
+      <w:start w:val="1"/>
+      <w:numFmt w:val="bullet"/>
+      <w:lvlText w:val="○"/>
+      <w:lvlJc w:val="left"/>
+      <w:pPr>
+        <w:ind w:left="5760" w:hanging="360"/>
+      </w:pPr>
+      <w:rPr>
+        <w:u w:val="none"/>
+      </w:rPr>
+    </w:lvl>
+    <w:lvl w:ilvl="8">
+      <w:start w:val="1"/>
+      <w:numFmt w:val="bullet"/>
+      <w:lvlText w:val="■"/>
+      <w:lvlJc w:val="left"/>
+      <w:pPr>
+        <w:ind w:left="6480" w:hanging="360"/>
+      </w:pPr>
+      <w:rPr>
+        <w:u w:val="none"/>
+      </w:rPr>
+    </w:lvl>
+  </w:abstractNum>
+  <w:abstractNum w:abstractNumId="14">
+    <w:lvl w:ilvl="0">
+      <w:start w:val="1"/>
+      <w:numFmt w:val="bullet"/>
+      <w:lvlText w:val="●"/>
+      <w:lvlJc w:val="left"/>
+      <w:pPr>
+        <w:ind w:left="720" w:hanging="360"/>
+      </w:pPr>
+      <w:rPr>
+        <w:rFonts w:ascii="Arial" w:cs="Arial" w:eastAsia="Arial" w:hAnsi="Arial"/>
+        <w:u w:val="none"/>
+      </w:rPr>
+    </w:lvl>
+    <w:lvl w:ilvl="1">
+      <w:start w:val="1"/>
+      <w:numFmt w:val="bullet"/>
+      <w:lvlText w:val="○"/>
+      <w:lvlJc w:val="left"/>
+      <w:pPr>
+        <w:ind w:left="1440" w:hanging="360"/>
+      </w:pPr>
+      <w:rPr>
+        <w:u w:val="none"/>
+      </w:rPr>
+    </w:lvl>
+    <w:lvl w:ilvl="2">
+      <w:start w:val="1"/>
+      <w:numFmt w:val="bullet"/>
+      <w:lvlText w:val="■"/>
+      <w:lvlJc w:val="left"/>
+      <w:pPr>
+        <w:ind w:left="2160" w:hanging="360"/>
+      </w:pPr>
+      <w:rPr>
+        <w:u w:val="none"/>
+      </w:rPr>
+    </w:lvl>
+    <w:lvl w:ilvl="3">
+      <w:start w:val="1"/>
+      <w:numFmt w:val="bullet"/>
+      <w:lvlText w:val="●"/>
+      <w:lvlJc w:val="left"/>
+      <w:pPr>
+        <w:ind w:left="2880" w:hanging="360"/>
+      </w:pPr>
+      <w:rPr>
+        <w:u w:val="none"/>
+      </w:rPr>
+    </w:lvl>
+    <w:lvl w:ilvl="4">
+      <w:start w:val="1"/>
+      <w:numFmt w:val="bullet"/>
+      <w:lvlText w:val="○"/>
+      <w:lvlJc w:val="left"/>
+      <w:pPr>
+        <w:ind w:left="3600" w:hanging="360"/>
+      </w:pPr>
+      <w:rPr>
+        <w:u w:val="none"/>
+      </w:rPr>
+    </w:lvl>
+    <w:lvl w:ilvl="5">
+      <w:start w:val="1"/>
+      <w:numFmt w:val="bullet"/>
+      <w:lvlText w:val="■"/>
+      <w:lvlJc w:val="left"/>
+      <w:pPr>
+        <w:ind w:left="4320" w:hanging="360"/>
+      </w:pPr>
+      <w:rPr>
+        <w:u w:val="none"/>
+      </w:rPr>
+    </w:lvl>
+    <w:lvl w:ilvl="6">
+      <w:start w:val="1"/>
+      <w:numFmt w:val="bullet"/>
+      <w:lvlText w:val="●"/>
+      <w:lvlJc w:val="left"/>
+      <w:pPr>
+        <w:ind w:left="5040" w:hanging="360"/>
+      </w:pPr>
+      <w:rPr>
+        <w:u w:val="none"/>
+      </w:rPr>
+    </w:lvl>
+    <w:lvl w:ilvl="7">
+      <w:start w:val="1"/>
+      <w:numFmt w:val="bullet"/>
+      <w:lvlText w:val="○"/>
+      <w:lvlJc w:val="left"/>
+      <w:pPr>
+        <w:ind w:left="5760" w:hanging="360"/>
+      </w:pPr>
+      <w:rPr>
+        <w:u w:val="none"/>
+      </w:rPr>
+    </w:lvl>
+    <w:lvl w:ilvl="8">
+      <w:start w:val="1"/>
+      <w:numFmt w:val="bullet"/>
+      <w:lvlText w:val="■"/>
+      <w:lvlJc w:val="left"/>
+      <w:pPr>
+        <w:ind w:left="6480" w:hanging="360"/>
+      </w:pPr>
+      <w:rPr>
+        <w:u w:val="none"/>
+      </w:rPr>
     </w:lvl>
   </w:abstractNum>
   <w:num w:numId="1">
@@ -7811,6 +9721,39 @@
   </w:num>
   <w:num w:numId="3">
     <w:abstractNumId w:val="3"/>
+  </w:num>
+  <w:num w:numId="4">
+    <w:abstractNumId w:val="4"/>
+  </w:num>
+  <w:num w:numId="5">
+    <w:abstractNumId w:val="5"/>
+  </w:num>
+  <w:num w:numId="6">
+    <w:abstractNumId w:val="6"/>
+  </w:num>
+  <w:num w:numId="7">
+    <w:abstractNumId w:val="7"/>
+  </w:num>
+  <w:num w:numId="8">
+    <w:abstractNumId w:val="8"/>
+  </w:num>
+  <w:num w:numId="9">
+    <w:abstractNumId w:val="9"/>
+  </w:num>
+  <w:num w:numId="10">
+    <w:abstractNumId w:val="10"/>
+  </w:num>
+  <w:num w:numId="11">
+    <w:abstractNumId w:val="11"/>
+  </w:num>
+  <w:num w:numId="12">
+    <w:abstractNumId w:val="12"/>
+  </w:num>
+  <w:num w:numId="13">
+    <w:abstractNumId w:val="13"/>
+  </w:num>
+  <w:num w:numId="14">
+    <w:abstractNumId w:val="14"/>
   </w:num>
 </w:numbering>
 </file>

</xml_diff>